<commit_message>
Update Ahmed Magdy's CV in DOCX and PDF formats to reflect recent professional experience and skills. Highlighted current role at MOG Group, detailing ERP system development and data migration projects. Enhanced project descriptions for Gen Z Wellness App and Leopard Stores, and refined technical skills section for clarity and accuracy.
</commit_message>
<xml_diff>
--- a/public/Ahmed_Magdy_CV.docx
+++ b/public/Ahmed_Magdy_CV.docx
@@ -167,7 +167,7 @@
         </w:rPr>
         <w:sectPr>
           <w:pgSz w:w="11906" w:h="16838" w:code="9"/>
-          <w:pgMar w:top="720" w:right="720" w:bottom="720" w:left="720" w:header="720" w:footer="720" w:gutter="0"/>
+          <w:pgMar w:top="936" w:right="720" w:bottom="936" w:left="720" w:header="720" w:footer="720" w:gutter="0"/>
           <w:cols w:space="720"/>
           <w:docGrid w:linePitch="360"/>
         </w:sectPr>
@@ -179,7 +179,82 @@
           <w:sz w:val="21"/>
           <w:szCs w:val="21"/>
         </w:rPr>
-        <w:t>Full Stack Engineer with hands-on experience building production-grade web applications using NestJS, Next.js, PostgreSQL, and MongoDB. Currently developing a healthcare platform (Gen Z App) covering everything from database architecture to responsive UI. Passionate about clean architecture and AI-powered tools, seeking a role at a product-driven tech company.</w:t>
+        <w:t xml:space="preserve">Full Stack Engineer with hands-on experience building production applications using </w:t>
+      </w:r>
+      <w:r>
+        <w:rPr>
+          <w:rFonts w:ascii="Calibri" w:hAnsi="Calibri" w:cs="Calibri"/>
+          <w:color w:val="0D0D0D" w:themeColor="text1" w:themeTint="F2"/>
+          <w:sz w:val="21"/>
+          <w:szCs w:val="21"/>
+        </w:rPr>
+        <w:t>Next.js</w:t>
+      </w:r>
+      <w:r>
+        <w:rPr>
+          <w:rFonts w:ascii="Calibri" w:hAnsi="Calibri" w:cs="Calibri"/>
+          <w:color w:val="0D0D0D" w:themeColor="text1" w:themeTint="F2"/>
+          <w:sz w:val="21"/>
+          <w:szCs w:val="21"/>
+        </w:rPr>
+        <w:t xml:space="preserve">, NestJS, PostgreSQL, and MongoDB. </w:t>
+      </w:r>
+      <w:r>
+        <w:rPr>
+          <w:rFonts w:ascii="Calibri" w:hAnsi="Calibri" w:cs="Calibri"/>
+          <w:color w:val="0D0D0D" w:themeColor="text1" w:themeTint="F2"/>
+          <w:sz w:val="21"/>
+          <w:szCs w:val="21"/>
+        </w:rPr>
+        <w:t>Currently leading a full digital transformation project at MOG Group, migrating legacy manual</w:t>
+      </w:r>
+      <w:r>
+        <w:t xml:space="preserve"> </w:t>
+      </w:r>
+      <w:r>
+        <w:rPr>
+          <w:rFonts w:ascii="Calibri" w:hAnsi="Calibri" w:cs="Calibri"/>
+          <w:color w:val="0D0D0D" w:themeColor="text1" w:themeTint="F2"/>
+          <w:sz w:val="21"/>
+          <w:szCs w:val="21"/>
+        </w:rPr>
+        <w:t>processes</w:t>
+      </w:r>
+      <w:r>
+        <w:rPr>
+          <w:rFonts w:ascii="Calibri" w:hAnsi="Calibri" w:cs="Calibri"/>
+          <w:color w:val="0D0D0D" w:themeColor="text1" w:themeTint="F2"/>
+          <w:sz w:val="21"/>
+          <w:szCs w:val="21"/>
+        </w:rPr>
+        <w:t xml:space="preserve"> into a modern </w:t>
+      </w:r>
+      <w:r>
+        <w:rPr>
+          <w:rFonts w:ascii="Calibri" w:hAnsi="Calibri" w:cs="Calibri"/>
+          <w:color w:val="0D0D0D" w:themeColor="text1" w:themeTint="F2"/>
+          <w:sz w:val="21"/>
+          <w:szCs w:val="21"/>
+        </w:rPr>
+        <w:t>ERP</w:t>
+      </w:r>
+      <w:r>
+        <w:rPr>
+          <w:rFonts w:ascii="Calibri" w:hAnsi="Calibri" w:cs="Calibri"/>
+          <w:color w:val="0D0D0D" w:themeColor="text1" w:themeTint="F2"/>
+          <w:sz w:val="21"/>
+          <w:szCs w:val="21"/>
+        </w:rPr>
+        <w:t xml:space="preserve">. </w:t>
+      </w:r>
+      <w:r>
+        <w:rPr>
+          <w:rFonts w:ascii="Calibri" w:hAnsi="Calibri" w:cs="Calibri"/>
+          <w:color w:val="0D0D0D" w:themeColor="text1" w:themeTint="F2"/>
+          <w:sz w:val="21"/>
+          <w:szCs w:val="21"/>
+        </w:rPr>
+        <w:t>Experienced in data modeling, system architecture, and translating business workflows into scalable software.</w:t>
       </w:r>
     </w:p>
     <w:p>
@@ -348,20 +423,374 @@
           <w:sz w:val="24"/>
           <w:szCs w:val="24"/>
         </w:rPr>
-        <w:t xml:space="preserve">Gen Z Wellness App </w:t>
-      </w:r>
+        <w:t>MOG Group</w:t>
+      </w:r>
+      <w:r>
+        <w:rPr>
+          <w:rFonts w:ascii="Calibri" w:hAnsi="Calibri" w:cs="Calibri"/>
+          <w:b/>
+          <w:color w:val="0D0D0D" w:themeColor="text1" w:themeTint="F2"/>
+          <w:sz w:val="24"/>
+          <w:szCs w:val="24"/>
+        </w:rPr>
+        <w:t xml:space="preserve"> -</w:t>
+      </w:r>
+      <w:r>
+        <w:rPr>
+          <w:rFonts w:ascii="Calibri" w:hAnsi="Calibri" w:cs="Calibri"/>
+          <w:b/>
+          <w:color w:val="0D0D0D" w:themeColor="text1" w:themeTint="F2"/>
+          <w:sz w:val="24"/>
+          <w:szCs w:val="24"/>
+        </w:rPr>
+        <w:t xml:space="preserve"> </w:t>
+      </w:r>
+      <w:r>
+        <w:rPr>
+          <w:rFonts w:ascii="Calibri" w:hAnsi="Calibri" w:cs="Calibri"/>
+          <w:bCs/>
+          <w:color w:val="404040" w:themeColor="text1" w:themeTint="BF"/>
+          <w:sz w:val="20"/>
+          <w:szCs w:val="20"/>
+        </w:rPr>
+        <w:t>Full Stack Engineer (</w:t>
+      </w:r>
+      <w:r>
+        <w:rPr>
+          <w:rFonts w:ascii="Calibri" w:hAnsi="Calibri" w:cs="Calibri"/>
+          <w:bCs/>
+          <w:color w:val="404040" w:themeColor="text1" w:themeTint="BF"/>
+          <w:sz w:val="20"/>
+          <w:szCs w:val="20"/>
+        </w:rPr>
+        <w:t>Full-</w:t>
+      </w:r>
+      <w:r>
+        <w:rPr>
+          <w:rFonts w:ascii="Calibri" w:hAnsi="Calibri" w:cs="Calibri"/>
+          <w:bCs/>
+          <w:color w:val="404040" w:themeColor="text1" w:themeTint="BF"/>
+          <w:sz w:val="20"/>
+          <w:szCs w:val="20"/>
+        </w:rPr>
+        <w:t>time</w:t>
+      </w:r>
+      <w:r>
+        <w:rPr>
+          <w:rFonts w:ascii="Calibri" w:hAnsi="Calibri" w:cs="Calibri"/>
+          <w:bCs/>
+          <w:color w:val="404040" w:themeColor="text1" w:themeTint="BF"/>
+          <w:sz w:val="20"/>
+          <w:szCs w:val="20"/>
+        </w:rPr>
+        <w:t xml:space="preserve">)  </w:t>
+      </w:r>
+      <w:r>
+        <w:rPr>
+          <w:rFonts w:ascii="Calibri" w:hAnsi="Calibri" w:cs="Calibri"/>
+          <w:bCs/>
+          <w:color w:val="404040" w:themeColor="text1" w:themeTint="BF"/>
+          <w:sz w:val="20"/>
+          <w:szCs w:val="20"/>
+        </w:rPr>
+        <w:t xml:space="preserve">      </w:t>
+      </w:r>
+      <w:r>
+        <w:rPr>
+          <w:rFonts w:ascii="Calibri" w:hAnsi="Calibri" w:cs="Calibri"/>
+          <w:bCs/>
+          <w:color w:val="404040" w:themeColor="text1" w:themeTint="BF"/>
+          <w:sz w:val="20"/>
+          <w:szCs w:val="20"/>
+        </w:rPr>
+        <w:t xml:space="preserve">    </w:t>
+      </w:r>
+      <w:r>
+        <w:rPr>
+          <w:rFonts w:ascii="Calibri" w:hAnsi="Calibri" w:cs="Calibri"/>
+          <w:bCs/>
+          <w:color w:val="404040" w:themeColor="text1" w:themeTint="BF"/>
+          <w:sz w:val="20"/>
+          <w:szCs w:val="20"/>
+        </w:rPr>
+        <w:t xml:space="preserve">         </w:t>
+      </w:r>
+      <w:r>
+        <w:rPr>
+          <w:rFonts w:ascii="Calibri" w:hAnsi="Calibri" w:cs="Calibri"/>
+          <w:bCs/>
+          <w:color w:val="404040" w:themeColor="text1" w:themeTint="BF"/>
+          <w:sz w:val="20"/>
+          <w:szCs w:val="20"/>
+        </w:rPr>
+        <w:t xml:space="preserve">                 </w:t>
+      </w:r>
+      <w:r>
+        <w:rPr>
+          <w:rFonts w:ascii="Calibri" w:hAnsi="Calibri" w:cs="Calibri"/>
+          <w:bCs/>
+          <w:color w:val="404040" w:themeColor="text1" w:themeTint="BF"/>
+          <w:sz w:val="20"/>
+          <w:szCs w:val="20"/>
+        </w:rPr>
+        <w:t xml:space="preserve"> </w:t>
+      </w:r>
+      <w:r>
+        <w:rPr>
+          <w:rFonts w:ascii="Calibri" w:hAnsi="Calibri" w:cs="Calibri"/>
+          <w:bCs/>
+          <w:color w:val="404040" w:themeColor="text1" w:themeTint="BF"/>
+          <w:sz w:val="20"/>
+          <w:szCs w:val="20"/>
+        </w:rPr>
+        <w:t xml:space="preserve">   </w:t>
+      </w:r>
+      <w:r>
+        <w:rPr>
+          <w:rFonts w:ascii="Calibri" w:hAnsi="Calibri" w:cs="Calibri"/>
+          <w:bCs/>
+          <w:color w:val="404040" w:themeColor="text1" w:themeTint="BF"/>
+          <w:sz w:val="20"/>
+          <w:szCs w:val="20"/>
+        </w:rPr>
+        <w:t xml:space="preserve">                                              </w:t>
+      </w:r>
+      <w:r>
+        <w:rPr>
+          <w:rFonts w:ascii="Calibri" w:hAnsi="Calibri" w:cs="Calibri"/>
+          <w:bCs/>
+          <w:color w:val="404040" w:themeColor="text1" w:themeTint="BF"/>
+          <w:sz w:val="20"/>
+          <w:szCs w:val="20"/>
+        </w:rPr>
+        <w:t xml:space="preserve">  </w:t>
+      </w:r>
+      <w:r>
+        <w:rPr>
+          <w:rFonts w:ascii="Calibri" w:hAnsi="Calibri" w:cs="Calibri"/>
+          <w:bCs/>
+          <w:color w:val="404040" w:themeColor="text1" w:themeTint="BF"/>
+          <w:sz w:val="20"/>
+          <w:szCs w:val="20"/>
+        </w:rPr>
+        <w:t xml:space="preserve">      </w:t>
+      </w:r>
+      <w:r>
+        <w:rPr>
+          <w:rFonts w:ascii="Calibri" w:hAnsi="Calibri" w:cs="Calibri"/>
+          <w:b/>
+          <w:color w:val="0D0D0D" w:themeColor="text1" w:themeTint="F2"/>
+          <w:sz w:val="20"/>
+          <w:szCs w:val="20"/>
+        </w:rPr>
+        <w:t>Jun</w:t>
+      </w:r>
+      <w:r>
+        <w:rPr>
+          <w:rFonts w:ascii="Calibri" w:hAnsi="Calibri" w:cs="Calibri"/>
+          <w:b/>
+          <w:color w:val="0D0D0D" w:themeColor="text1" w:themeTint="F2"/>
+          <w:sz w:val="20"/>
+          <w:szCs w:val="20"/>
+        </w:rPr>
+        <w:t xml:space="preserve"> 202</w:t>
+      </w:r>
+      <w:r>
+        <w:rPr>
+          <w:rFonts w:ascii="Calibri" w:hAnsi="Calibri" w:cs="Calibri"/>
+          <w:b/>
+          <w:color w:val="0D0D0D" w:themeColor="text1" w:themeTint="F2"/>
+          <w:sz w:val="20"/>
+          <w:szCs w:val="20"/>
+        </w:rPr>
+        <w:t>6</w:t>
+      </w:r>
+      <w:r>
+        <w:rPr>
+          <w:rFonts w:ascii="Calibri" w:hAnsi="Calibri" w:cs="Calibri"/>
+          <w:b/>
+          <w:color w:val="0D0D0D" w:themeColor="text1" w:themeTint="F2"/>
+          <w:sz w:val="20"/>
+          <w:szCs w:val="20"/>
+        </w:rPr>
+        <w:t xml:space="preserve"> - Present | </w:t>
+      </w:r>
+      <w:r>
+        <w:rPr>
+          <w:rFonts w:ascii="Calibri" w:hAnsi="Calibri" w:cs="Calibri"/>
+          <w:b/>
+          <w:color w:val="0D0D0D" w:themeColor="text1" w:themeTint="F2"/>
+          <w:sz w:val="20"/>
+          <w:szCs w:val="20"/>
+        </w:rPr>
+        <w:t>On-site</w:t>
+      </w:r>
+    </w:p>
+    <w:p>
+      <w:pPr>
+        <w:pStyle w:val="Style1"/>
+        <w:numPr>
+          <w:ilvl w:val="0"/>
+          <w:numId w:val="1"/>
+        </w:numPr>
+        <w:spacing w:line="276" w:lineRule="auto"/>
+        <w:rPr>
+          <w:rFonts w:ascii="Calibri" w:hAnsi="Calibri" w:cs="Calibri"/>
+          <w:color w:val="262626" w:themeColor="text1" w:themeTint="D9"/>
+        </w:rPr>
+      </w:pPr>
+      <w:r>
+        <w:rPr>
+          <w:rFonts w:ascii="Calibri" w:hAnsi="Calibri" w:cs="Calibri"/>
+          <w:color w:val="262626" w:themeColor="text1" w:themeTint="D9"/>
+        </w:rPr>
+        <w:t xml:space="preserve">Leading </w:t>
+      </w:r>
+      <w:r>
+        <w:rPr>
+          <w:rFonts w:ascii="Calibri" w:hAnsi="Calibri" w:cs="Calibri"/>
+          <w:b/>
+          <w:bCs/>
+          <w:color w:val="262626" w:themeColor="text1" w:themeTint="D9"/>
+        </w:rPr>
+        <w:t>design and development of a custom ERP system</w:t>
+      </w:r>
+      <w:r>
+        <w:rPr>
+          <w:rFonts w:ascii="Calibri" w:hAnsi="Calibri" w:cs="Calibri"/>
+          <w:color w:val="262626" w:themeColor="text1" w:themeTint="D9"/>
+        </w:rPr>
+        <w:t xml:space="preserve"> from scratch, working closely with business operations to translate existing workflows into system requirements and deliver functionality incrementally.</w:t>
+      </w:r>
+    </w:p>
+    <w:p>
+      <w:pPr>
+        <w:pStyle w:val="Style1"/>
+        <w:numPr>
+          <w:ilvl w:val="0"/>
+          <w:numId w:val="1"/>
+        </w:numPr>
+        <w:spacing w:line="276" w:lineRule="auto"/>
+        <w:rPr>
+          <w:rFonts w:ascii="Calibri" w:hAnsi="Calibri" w:cs="Calibri"/>
+          <w:color w:val="262626" w:themeColor="text1" w:themeTint="D9"/>
+        </w:rPr>
+      </w:pPr>
+      <w:r>
+        <w:rPr>
+          <w:rFonts w:ascii="Calibri" w:hAnsi="Calibri" w:cs="Calibri"/>
+          <w:color w:val="262626" w:themeColor="text1" w:themeTint="D9"/>
+        </w:rPr>
+        <w:t>Designing and implementing</w:t>
+      </w:r>
+      <w:r>
+        <w:rPr>
+          <w:rFonts w:ascii="Calibri" w:hAnsi="Calibri" w:cs="Calibri"/>
+          <w:color w:val="262626" w:themeColor="text1" w:themeTint="D9"/>
+        </w:rPr>
+        <w:t xml:space="preserve"> 7</w:t>
+      </w:r>
+      <w:r>
+        <w:rPr>
+          <w:rFonts w:ascii="Calibri" w:hAnsi="Calibri" w:cs="Calibri"/>
+          <w:color w:val="262626" w:themeColor="text1" w:themeTint="D9"/>
+        </w:rPr>
+        <w:t xml:space="preserve"> core ERP modules covering purchasing, inventory, production,</w:t>
+      </w:r>
+      <w:r>
+        <w:rPr>
+          <w:rFonts w:ascii="Calibri" w:hAnsi="Calibri" w:cs="Calibri"/>
+          <w:color w:val="262626" w:themeColor="text1" w:themeTint="D9"/>
+        </w:rPr>
+        <w:t xml:space="preserve"> sales,</w:t>
+      </w:r>
+      <w:r>
+        <w:rPr>
+          <w:rFonts w:ascii="Calibri" w:hAnsi="Calibri" w:cs="Calibri"/>
+          <w:color w:val="262626" w:themeColor="text1" w:themeTint="D9"/>
+        </w:rPr>
+        <w:t xml:space="preserve"> accounting, </w:t>
+      </w:r>
+      <w:r>
+        <w:rPr>
+          <w:rFonts w:ascii="Calibri" w:hAnsi="Calibri" w:cs="Calibri"/>
+          <w:color w:val="262626" w:themeColor="text1" w:themeTint="D9"/>
+        </w:rPr>
+        <w:t xml:space="preserve">HR </w:t>
+      </w:r>
+      <w:r>
+        <w:rPr>
+          <w:rFonts w:ascii="Calibri" w:hAnsi="Calibri" w:cs="Calibri"/>
+          <w:color w:val="262626" w:themeColor="text1" w:themeTint="D9"/>
+        </w:rPr>
+        <w:t xml:space="preserve">and other business operations using </w:t>
+      </w:r>
+      <w:r>
+        <w:rPr>
+          <w:rFonts w:ascii="Calibri" w:hAnsi="Calibri" w:cs="Calibri"/>
+          <w:b/>
+          <w:bCs/>
+          <w:color w:val="262626" w:themeColor="text1" w:themeTint="D9"/>
+        </w:rPr>
+        <w:t>Next.js, NestJS, Drizzle ORM, and PostgreSQL</w:t>
+      </w:r>
+      <w:r>
+        <w:rPr>
+          <w:rFonts w:ascii="Calibri" w:hAnsi="Calibri" w:cs="Calibri"/>
+          <w:color w:val="262626" w:themeColor="text1" w:themeTint="D9"/>
+        </w:rPr>
+        <w:t>.</w:t>
+      </w:r>
+    </w:p>
+    <w:p>
+      <w:pPr>
+        <w:pStyle w:val="Style1"/>
+        <w:numPr>
+          <w:ilvl w:val="0"/>
+          <w:numId w:val="1"/>
+        </w:numPr>
+        <w:spacing w:line="276" w:lineRule="auto"/>
+        <w:rPr>
+          <w:rFonts w:ascii="Calibri" w:hAnsi="Calibri" w:cs="Calibri"/>
+          <w:color w:val="262626" w:themeColor="text1" w:themeTint="D9"/>
+        </w:rPr>
+      </w:pPr>
+      <w:r>
+        <w:rPr>
+          <w:rFonts w:ascii="Calibri" w:hAnsi="Calibri" w:cs="Calibri"/>
+          <w:color w:val="262626" w:themeColor="text1" w:themeTint="D9"/>
+        </w:rPr>
+        <w:t>Migrating and restructuring historical business data from the legacy system into the new database architecture, ensuring data integrity and consistency throughout the transition.</w:t>
+      </w:r>
+    </w:p>
+    <w:p>
+      <w:pPr>
+        <w:pStyle w:val="NoSpacing"/>
+        <w:tabs>
+          <w:tab w:val="left" w:pos="8460"/>
+          <w:tab w:val="right" w:pos="10080"/>
+        </w:tabs>
+        <w:spacing w:before="100" w:after="100"/>
+        <w:rPr>
+          <w:rFonts w:ascii="Calibri" w:hAnsi="Calibri" w:cs="Calibri"/>
+          <w:bCs/>
+          <w:color w:val="0D0D0D" w:themeColor="text1" w:themeTint="F2"/>
+          <w:sz w:val="24"/>
+          <w:szCs w:val="24"/>
+        </w:rPr>
+      </w:pPr>
       <w:hyperlink r:id="rId9" w:history="1">
         <w:r>
           <w:rPr>
             <w:rStyle w:val="Hyperlink"/>
-            <w:rFonts w:ascii="Segoe UI Emoji" w:hAnsi="Segoe UI Emoji" w:cs="Segoe UI Emoji"/>
+            <w:rFonts w:ascii="Calibri" w:hAnsi="Calibri" w:cs="Calibri"/>
             <w:b/>
-            <w:color w:val="4B8090" w:themeColor="hyperlink" w:themeTint="F2"/>
-            <w:sz w:val="16"/>
-            <w:szCs w:val="16"/>
+            <w:color w:val="0D0D0D" w:themeColor="text1" w:themeTint="F2"/>
+            <w:sz w:val="24"/>
+            <w:szCs w:val="24"/>
             <w:u w:val="none"/>
           </w:rPr>
-          <w:t>🔗</w:t>
+          <w:t>Gen Z Wellness App</w:t>
         </w:r>
       </w:hyperlink>
       <w:r>
@@ -369,8 +798,18 @@
           <w:rFonts w:ascii="Calibri" w:hAnsi="Calibri" w:cs="Calibri"/>
           <w:b/>
           <w:color w:val="0D0D0D" w:themeColor="text1" w:themeTint="F2"/>
-          <w:sz w:val="16"/>
-          <w:szCs w:val="16"/>
+          <w:sz w:val="24"/>
+          <w:szCs w:val="24"/>
+        </w:rPr>
+        <w:t xml:space="preserve"> -</w:t>
+      </w:r>
+      <w:r>
+        <w:rPr>
+          <w:rFonts w:ascii="Calibri" w:hAnsi="Calibri" w:cs="Calibri"/>
+          <w:b/>
+          <w:color w:val="0D0D0D" w:themeColor="text1" w:themeTint="F2"/>
+          <w:sz w:val="24"/>
+          <w:szCs w:val="24"/>
         </w:rPr>
         <w:t xml:space="preserve"> </w:t>
       </w:r>
@@ -382,7 +821,27 @@
           <w:sz w:val="20"/>
           <w:szCs w:val="20"/>
         </w:rPr>
-        <w:t xml:space="preserve">Full Stack Engineer (Contract)                                                                          </w:t>
+        <w:t xml:space="preserve">Full Stack Engineer (Contract)                                                                </w:t>
+      </w:r>
+      <w:r>
+        <w:rPr>
+          <w:rFonts w:ascii="Calibri" w:hAnsi="Calibri" w:cs="Calibri"/>
+          <w:bCs/>
+          <w:color w:val="404040" w:themeColor="text1" w:themeTint="BF"/>
+          <w:sz w:val="20"/>
+          <w:szCs w:val="20"/>
+        </w:rPr>
+        <w:t xml:space="preserve">   </w:t>
+      </w:r>
+      <w:r>
+        <w:rPr>
+          <w:rFonts w:ascii="Calibri" w:hAnsi="Calibri" w:cs="Calibri"/>
+          <w:bCs/>
+          <w:color w:val="404040" w:themeColor="text1" w:themeTint="BF"/>
+          <w:sz w:val="20"/>
+          <w:szCs w:val="20"/>
+        </w:rPr>
+        <w:t xml:space="preserve">        </w:t>
       </w:r>
       <w:r>
         <w:rPr>
@@ -392,7 +851,27 @@
           <w:sz w:val="20"/>
           <w:szCs w:val="20"/>
         </w:rPr>
-        <w:t>Dec 2025 - Present | Remote</w:t>
+        <w:t xml:space="preserve">Dec 2025 - </w:t>
+      </w:r>
+      <w:r>
+        <w:rPr>
+          <w:rFonts w:ascii="Calibri" w:hAnsi="Calibri" w:cs="Calibri"/>
+          <w:b/>
+          <w:color w:val="0D0D0D" w:themeColor="text1" w:themeTint="F2"/>
+          <w:sz w:val="20"/>
+          <w:szCs w:val="20"/>
+        </w:rPr>
+        <w:t>Jun 2026</w:t>
+      </w:r>
+      <w:r>
+        <w:rPr>
+          <w:rFonts w:ascii="Calibri" w:hAnsi="Calibri" w:cs="Calibri"/>
+          <w:b/>
+          <w:color w:val="0D0D0D" w:themeColor="text1" w:themeTint="F2"/>
+          <w:sz w:val="20"/>
+          <w:szCs w:val="20"/>
+        </w:rPr>
+        <w:t xml:space="preserve"> | Remote</w:t>
       </w:r>
     </w:p>
     <w:p>
@@ -448,6 +927,13 @@
         </w:rPr>
         <w:t>, ensuring zero data loss</w:t>
       </w:r>
+      <w:r>
+        <w:rPr>
+          <w:rFonts w:ascii="Calibri" w:hAnsi="Calibri" w:cs="Calibri"/>
+          <w:color w:val="262626" w:themeColor="text1" w:themeTint="D9"/>
+        </w:rPr>
+        <w:t>.</w:t>
+      </w:r>
     </w:p>
     <w:p>
       <w:pPr>
@@ -466,18 +952,39 @@
       <w:r>
         <w:rPr>
           <w:rFonts w:ascii="Calibri" w:hAnsi="Calibri" w:cs="Calibri"/>
-          <w:b/>
-          <w:bCs/>
-          <w:color w:val="262626" w:themeColor="text1" w:themeTint="D9"/>
-        </w:rPr>
-        <w:t>Migrated a legacy React codebase to Next.js across 50+ pages,</w:t>
-      </w:r>
-      <w:r>
-        <w:rPr>
-          <w:rFonts w:ascii="Calibri" w:hAnsi="Calibri" w:cs="Calibri"/>
-          <w:color w:val="262626" w:themeColor="text1" w:themeTint="D9"/>
-        </w:rPr>
-        <w:t xml:space="preserve"> improving performance, SEO, and scalability</w:t>
+          <w:color w:val="262626" w:themeColor="text1" w:themeTint="D9"/>
+        </w:rPr>
+        <w:t xml:space="preserve">Migrated a legacy </w:t>
+      </w:r>
+      <w:r>
+        <w:rPr>
+          <w:rFonts w:ascii="Calibri" w:hAnsi="Calibri" w:cs="Calibri"/>
+          <w:b/>
+          <w:bCs/>
+          <w:color w:val="262626" w:themeColor="text1" w:themeTint="D9"/>
+        </w:rPr>
+        <w:t>React codebase to Next.js across 50+ pages</w:t>
+      </w:r>
+      <w:r>
+        <w:rPr>
+          <w:rFonts w:ascii="Calibri" w:hAnsi="Calibri" w:cs="Calibri"/>
+          <w:color w:val="262626" w:themeColor="text1" w:themeTint="D9"/>
+        </w:rPr>
+        <w:t xml:space="preserve">, </w:t>
+      </w:r>
+      <w:r>
+        <w:rPr>
+          <w:rFonts w:ascii="Calibri" w:hAnsi="Calibri" w:cs="Calibri"/>
+          <w:color w:val="262626" w:themeColor="text1" w:themeTint="D9"/>
+        </w:rPr>
+        <w:t>improving performance, SEO, and scalability</w:t>
+      </w:r>
+      <w:r>
+        <w:rPr>
+          <w:rFonts w:ascii="Calibri" w:hAnsi="Calibri" w:cs="Calibri"/>
+          <w:color w:val="262626" w:themeColor="text1" w:themeTint="D9"/>
+        </w:rPr>
+        <w:t>.</w:t>
       </w:r>
     </w:p>
     <w:p>
@@ -497,25 +1004,41 @@
       <w:r>
         <w:rPr>
           <w:rFonts w:ascii="Calibri" w:hAnsi="Calibri" w:cs="Calibri"/>
-          <w:color w:val="262626" w:themeColor="text1" w:themeTint="D9"/>
-        </w:rPr>
-        <w:t xml:space="preserve">Designed a modular </w:t>
-      </w:r>
-      <w:r>
-        <w:rPr>
-          <w:rFonts w:ascii="Calibri" w:hAnsi="Calibri" w:cs="Calibri"/>
-          <w:b/>
-          <w:bCs/>
-          <w:color w:val="262626" w:themeColor="text1" w:themeTint="D9"/>
-        </w:rPr>
-        <w:t>internationalized architecture (i18n)</w:t>
-      </w:r>
-      <w:r>
-        <w:rPr>
-          <w:rFonts w:ascii="Calibri" w:hAnsi="Calibri" w:cs="Calibri"/>
-          <w:color w:val="262626" w:themeColor="text1" w:themeTint="D9"/>
-        </w:rPr>
-        <w:t xml:space="preserve"> supporting Arabic and English</w:t>
+          <w:b/>
+          <w:bCs/>
+          <w:color w:val="262626" w:themeColor="text1" w:themeTint="D9"/>
+        </w:rPr>
+        <w:t>Improved page load performance by ~45%</w:t>
+      </w:r>
+      <w:r>
+        <w:rPr>
+          <w:rFonts w:ascii="Calibri" w:hAnsi="Calibri" w:cs="Calibri"/>
+          <w:color w:val="262626" w:themeColor="text1" w:themeTint="D9"/>
+        </w:rPr>
+        <w:t xml:space="preserve"> using Incremental Static Regeneration (</w:t>
+      </w:r>
+      <w:r>
+        <w:rPr>
+          <w:rFonts w:ascii="Calibri" w:hAnsi="Calibri" w:cs="Calibri"/>
+          <w:b/>
+          <w:bCs/>
+          <w:color w:val="262626" w:themeColor="text1" w:themeTint="D9"/>
+        </w:rPr>
+        <w:t>ISR</w:t>
+      </w:r>
+      <w:r>
+        <w:rPr>
+          <w:rFonts w:ascii="Calibri" w:hAnsi="Calibri" w:cs="Calibri"/>
+          <w:color w:val="262626" w:themeColor="text1" w:themeTint="D9"/>
+        </w:rPr>
+        <w:t>) and image optimization</w:t>
+      </w:r>
+      <w:r>
+        <w:rPr>
+          <w:rFonts w:ascii="Calibri" w:hAnsi="Calibri" w:cs="Calibri"/>
+          <w:color w:val="262626" w:themeColor="text1" w:themeTint="D9"/>
+        </w:rPr>
+        <w:t>.</w:t>
       </w:r>
     </w:p>
     <w:p>
@@ -537,32 +1060,39 @@
           <w:rFonts w:ascii="Calibri" w:hAnsi="Calibri" w:cs="Calibri"/>
           <w:color w:val="262626" w:themeColor="text1" w:themeTint="D9"/>
         </w:rPr>
-        <w:t xml:space="preserve">Built a </w:t>
-      </w:r>
-      <w:r>
-        <w:rPr>
-          <w:rFonts w:ascii="Calibri" w:hAnsi="Calibri" w:cs="Calibri"/>
-          <w:b/>
-          <w:bCs/>
-          <w:color w:val="262626" w:themeColor="text1" w:themeTint="D9"/>
-        </w:rPr>
-        <w:t>session booking system</w:t>
-      </w:r>
-      <w:r>
-        <w:rPr>
-          <w:rFonts w:ascii="Calibri" w:hAnsi="Calibri" w:cs="Calibri"/>
-          <w:color w:val="262626" w:themeColor="text1" w:themeTint="D9"/>
-        </w:rPr>
-        <w:t xml:space="preserve"> connecting </w:t>
-      </w:r>
-      <w:r>
-        <w:rPr>
-          <w:rFonts w:ascii="Calibri" w:hAnsi="Calibri" w:cs="Calibri"/>
-          <w:b/>
-          <w:bCs/>
-          <w:color w:val="262626" w:themeColor="text1" w:themeTint="D9"/>
-        </w:rPr>
-        <w:t>users with 50+ verified care providers</w:t>
+        <w:t>Built a Google Calendar-integrated</w:t>
+      </w:r>
+      <w:r>
+        <w:rPr>
+          <w:rFonts w:ascii="Calibri" w:hAnsi="Calibri" w:cs="Calibri"/>
+          <w:color w:val="262626" w:themeColor="text1" w:themeTint="D9"/>
+        </w:rPr>
+        <w:t xml:space="preserve"> </w:t>
+      </w:r>
+      <w:r>
+        <w:rPr>
+          <w:rFonts w:ascii="Calibri" w:hAnsi="Calibri" w:cs="Calibri"/>
+          <w:b/>
+          <w:bCs/>
+          <w:color w:val="262626" w:themeColor="text1" w:themeTint="D9"/>
+        </w:rPr>
+        <w:t>session</w:t>
+      </w:r>
+      <w:r>
+        <w:rPr>
+          <w:rFonts w:ascii="Calibri" w:hAnsi="Calibri" w:cs="Calibri"/>
+          <w:b/>
+          <w:bCs/>
+          <w:color w:val="262626" w:themeColor="text1" w:themeTint="D9"/>
+        </w:rPr>
+        <w:t xml:space="preserve"> booking system</w:t>
+      </w:r>
+      <w:r>
+        <w:rPr>
+          <w:rFonts w:ascii="Calibri" w:hAnsi="Calibri" w:cs="Calibri"/>
+          <w:color w:val="262626" w:themeColor="text1" w:themeTint="D9"/>
+        </w:rPr>
+        <w:t xml:space="preserve"> linking users with 50+ verified care providers.</w:t>
       </w:r>
     </w:p>
     <w:p>
@@ -584,23 +1114,39 @@
           <w:rFonts w:ascii="Calibri" w:hAnsi="Calibri" w:cs="Calibri"/>
           <w:color w:val="262626" w:themeColor="text1" w:themeTint="D9"/>
         </w:rPr>
-        <w:t xml:space="preserve">Built </w:t>
-      </w:r>
-      <w:r>
-        <w:rPr>
-          <w:rFonts w:ascii="Calibri" w:hAnsi="Calibri" w:cs="Calibri"/>
-          <w:b/>
-          <w:bCs/>
-          <w:color w:val="262626" w:themeColor="text1" w:themeTint="D9"/>
-        </w:rPr>
-        <w:t>real-time chat and community system using WebSockets</w:t>
-      </w:r>
-      <w:r>
-        <w:rPr>
-          <w:rFonts w:ascii="Calibri" w:hAnsi="Calibri" w:cs="Calibri"/>
-          <w:color w:val="262626" w:themeColor="text1" w:themeTint="D9"/>
-        </w:rPr>
-        <w:t xml:space="preserve"> supporting live interactions across users</w:t>
+        <w:t xml:space="preserve">Built a </w:t>
+      </w:r>
+      <w:r>
+        <w:rPr>
+          <w:rFonts w:ascii="Calibri" w:hAnsi="Calibri" w:cs="Calibri"/>
+          <w:b/>
+          <w:bCs/>
+          <w:color w:val="262626" w:themeColor="text1" w:themeTint="D9"/>
+        </w:rPr>
+        <w:t>multi-vendor marketplace</w:t>
+      </w:r>
+      <w:r>
+        <w:rPr>
+          <w:rFonts w:ascii="Calibri" w:hAnsi="Calibri" w:cs="Calibri"/>
+          <w:color w:val="262626" w:themeColor="text1" w:themeTint="D9"/>
+        </w:rPr>
+        <w:t xml:space="preserve"> expanding operations across Egypt, Canada, and the US with </w:t>
+      </w:r>
+      <w:r>
+        <w:rPr>
+          <w:rFonts w:ascii="Calibri" w:hAnsi="Calibri" w:cs="Calibri"/>
+          <w:b/>
+          <w:bCs/>
+          <w:color w:val="262626" w:themeColor="text1" w:themeTint="D9"/>
+        </w:rPr>
+        <w:t>Stripe payments</w:t>
+      </w:r>
+      <w:r>
+        <w:rPr>
+          <w:rFonts w:ascii="Calibri" w:hAnsi="Calibri" w:cs="Calibri"/>
+          <w:color w:val="262626" w:themeColor="text1" w:themeTint="D9"/>
+        </w:rPr>
+        <w:t>.</w:t>
       </w:r>
     </w:p>
     <w:p>
@@ -620,18 +1166,55 @@
       <w:r>
         <w:rPr>
           <w:rFonts w:ascii="Calibri" w:hAnsi="Calibri" w:cs="Calibri"/>
-          <w:b/>
-          <w:bCs/>
-          <w:color w:val="262626" w:themeColor="text1" w:themeTint="D9"/>
-        </w:rPr>
-        <w:t>Migrated the app from Azure to a VPS</w:t>
-      </w:r>
-      <w:r>
-        <w:rPr>
-          <w:rFonts w:ascii="Calibri" w:hAnsi="Calibri" w:cs="Calibri"/>
-          <w:color w:val="262626" w:themeColor="text1" w:themeTint="D9"/>
-        </w:rPr>
-        <w:t>, reducing costs and improving server performance and security</w:t>
+          <w:color w:val="262626" w:themeColor="text1" w:themeTint="D9"/>
+        </w:rPr>
+        <w:t>Built</w:t>
+      </w:r>
+      <w:r>
+        <w:rPr>
+          <w:rFonts w:ascii="Calibri" w:hAnsi="Calibri" w:cs="Calibri"/>
+          <w:color w:val="262626" w:themeColor="text1" w:themeTint="D9"/>
+        </w:rPr>
+        <w:t xml:space="preserve"> automated </w:t>
+      </w:r>
+      <w:r>
+        <w:rPr>
+          <w:rFonts w:ascii="Calibri" w:hAnsi="Calibri" w:cs="Calibri"/>
+          <w:b/>
+          <w:bCs/>
+          <w:color w:val="262626" w:themeColor="text1" w:themeTint="D9"/>
+        </w:rPr>
+        <w:t>CI/CD pipelines</w:t>
+      </w:r>
+      <w:r>
+        <w:rPr>
+          <w:rFonts w:ascii="Calibri" w:hAnsi="Calibri" w:cs="Calibri"/>
+          <w:color w:val="262626" w:themeColor="text1" w:themeTint="D9"/>
+        </w:rPr>
+        <w:t xml:space="preserve"> for both </w:t>
+      </w:r>
+      <w:r>
+        <w:rPr>
+          <w:rFonts w:ascii="Calibri" w:hAnsi="Calibri" w:cs="Calibri"/>
+          <w:b/>
+          <w:bCs/>
+          <w:color w:val="262626" w:themeColor="text1" w:themeTint="D9"/>
+        </w:rPr>
+        <w:t>Staging and Production</w:t>
+      </w:r>
+      <w:r>
+        <w:rPr>
+          <w:rFonts w:ascii="Calibri" w:hAnsi="Calibri" w:cs="Calibri"/>
+          <w:color w:val="262626" w:themeColor="text1" w:themeTint="D9"/>
+        </w:rPr>
+        <w:t xml:space="preserve"> environments using GitHub Actions</w:t>
+      </w:r>
+      <w:r>
+        <w:rPr>
+          <w:rFonts w:ascii="Calibri" w:hAnsi="Calibri" w:cs="Calibri"/>
+          <w:color w:val="262626" w:themeColor="text1" w:themeTint="D9"/>
+        </w:rPr>
+        <w:t>.</w:t>
       </w:r>
     </w:p>
     <w:p>
@@ -651,41 +1234,34 @@
       <w:r>
         <w:rPr>
           <w:rFonts w:ascii="Calibri" w:hAnsi="Calibri" w:cs="Calibri"/>
-          <w:color w:val="262626" w:themeColor="text1" w:themeTint="D9"/>
-        </w:rPr>
-        <w:t xml:space="preserve">Engineered automated </w:t>
-      </w:r>
-      <w:r>
-        <w:rPr>
-          <w:rFonts w:ascii="Calibri" w:hAnsi="Calibri" w:cs="Calibri"/>
-          <w:b/>
-          <w:bCs/>
-          <w:color w:val="262626" w:themeColor="text1" w:themeTint="D9"/>
-        </w:rPr>
-        <w:t>CI/CD pipelines</w:t>
-      </w:r>
-      <w:r>
-        <w:rPr>
-          <w:rFonts w:ascii="Calibri" w:hAnsi="Calibri" w:cs="Calibri"/>
-          <w:color w:val="262626" w:themeColor="text1" w:themeTint="D9"/>
-        </w:rPr>
-        <w:t xml:space="preserve"> for both </w:t>
-      </w:r>
-      <w:r>
-        <w:rPr>
-          <w:rFonts w:ascii="Calibri" w:hAnsi="Calibri" w:cs="Calibri"/>
-          <w:b/>
-          <w:bCs/>
-          <w:color w:val="262626" w:themeColor="text1" w:themeTint="D9"/>
-        </w:rPr>
-        <w:t>Staging and Production</w:t>
-      </w:r>
-      <w:r>
-        <w:rPr>
-          <w:rFonts w:ascii="Calibri" w:hAnsi="Calibri" w:cs="Calibri"/>
-          <w:color w:val="262626" w:themeColor="text1" w:themeTint="D9"/>
-        </w:rPr>
-        <w:t xml:space="preserve"> environments using GitHub Actions</w:t>
+          <w:b/>
+          <w:bCs/>
+          <w:color w:val="262626" w:themeColor="text1" w:themeTint="D9"/>
+        </w:rPr>
+        <w:t xml:space="preserve">Migrated </w:t>
+      </w:r>
+      <w:r>
+        <w:rPr>
+          <w:rFonts w:ascii="Calibri" w:hAnsi="Calibri" w:cs="Calibri"/>
+          <w:b/>
+          <w:bCs/>
+          <w:color w:val="262626" w:themeColor="text1" w:themeTint="D9"/>
+        </w:rPr>
+        <w:t>the app from Azure to a VPS</w:t>
+      </w:r>
+      <w:r>
+        <w:rPr>
+          <w:rFonts w:ascii="Calibri" w:hAnsi="Calibri" w:cs="Calibri"/>
+          <w:color w:val="262626" w:themeColor="text1" w:themeTint="D9"/>
+        </w:rPr>
+        <w:t>, reducing costs and improving server performance and security</w:t>
+      </w:r>
+      <w:r>
+        <w:rPr>
+          <w:rFonts w:ascii="Calibri" w:hAnsi="Calibri" w:cs="Calibri"/>
+          <w:color w:val="262626" w:themeColor="text1" w:themeTint="D9"/>
+        </w:rPr>
+        <w:t>.</w:t>
       </w:r>
     </w:p>
     <w:p>
@@ -704,39 +1280,111 @@
           <w:szCs w:val="24"/>
         </w:rPr>
       </w:pPr>
-      <w:r>
-        <w:rPr>
-          <w:rFonts w:ascii="Calibri" w:hAnsi="Calibri" w:cs="Calibri"/>
-          <w:b/>
-          <w:color w:val="0D0D0D" w:themeColor="text1" w:themeTint="F2"/>
-          <w:sz w:val="24"/>
-          <w:szCs w:val="24"/>
-        </w:rPr>
-        <w:t xml:space="preserve">Leopard ERP &amp; Online Store </w:t>
-      </w:r>
       <w:hyperlink r:id="rId10" w:history="1">
         <w:r>
           <w:rPr>
             <w:rStyle w:val="Hyperlink"/>
-            <w:rFonts w:ascii="Segoe UI Emoji" w:hAnsi="Segoe UI Emoji" w:cs="Segoe UI Emoji"/>
+            <w:rFonts w:ascii="Calibri" w:hAnsi="Calibri" w:cs="Calibri"/>
             <w:b/>
-            <w:color w:val="4B8090" w:themeColor="hyperlink" w:themeTint="F2"/>
-            <w:sz w:val="16"/>
-            <w:szCs w:val="16"/>
+            <w:color w:val="0D0D0D" w:themeColor="text1" w:themeTint="F2"/>
+            <w:sz w:val="24"/>
+            <w:szCs w:val="24"/>
             <w:u w:val="none"/>
           </w:rPr>
-          <w:t>🔗</w:t>
+          <w:t>Leopard Store</w:t>
+        </w:r>
+        <w:r>
+          <w:rPr>
+            <w:rStyle w:val="Hyperlink"/>
+            <w:rFonts w:ascii="Calibri" w:hAnsi="Calibri" w:cs="Calibri"/>
+            <w:b/>
+            <w:color w:val="0D0D0D" w:themeColor="text1" w:themeTint="F2"/>
+            <w:sz w:val="24"/>
+            <w:szCs w:val="24"/>
+            <w:u w:val="none"/>
+          </w:rPr>
+          <w:t>s</w:t>
         </w:r>
       </w:hyperlink>
       <w:r>
         <w:rPr>
           <w:rFonts w:ascii="Calibri" w:hAnsi="Calibri" w:cs="Calibri"/>
+          <w:b/>
+          <w:color w:val="0D0D0D" w:themeColor="text1" w:themeTint="F2"/>
+          <w:sz w:val="24"/>
+          <w:szCs w:val="24"/>
+        </w:rPr>
+        <w:t xml:space="preserve"> - </w:t>
+      </w:r>
+      <w:r>
+        <w:rPr>
+          <w:rFonts w:ascii="Calibri" w:hAnsi="Calibri" w:cs="Calibri"/>
           <w:bCs/>
           <w:color w:val="404040" w:themeColor="text1" w:themeTint="BF"/>
           <w:sz w:val="20"/>
           <w:szCs w:val="20"/>
         </w:rPr>
-        <w:t xml:space="preserve"> Full Stack Engineer (Contract)                                                       </w:t>
+        <w:t xml:space="preserve">Full Stack Engineer (Contract)                     </w:t>
+      </w:r>
+      <w:r>
+        <w:rPr>
+          <w:rFonts w:ascii="Calibri" w:hAnsi="Calibri" w:cs="Calibri"/>
+          <w:bCs/>
+          <w:color w:val="404040" w:themeColor="text1" w:themeTint="BF"/>
+          <w:sz w:val="20"/>
+          <w:szCs w:val="20"/>
+        </w:rPr>
+        <w:t xml:space="preserve">                            </w:t>
+      </w:r>
+      <w:r>
+        <w:rPr>
+          <w:rFonts w:ascii="Calibri" w:hAnsi="Calibri" w:cs="Calibri"/>
+          <w:bCs/>
+          <w:color w:val="404040" w:themeColor="text1" w:themeTint="BF"/>
+          <w:sz w:val="20"/>
+          <w:szCs w:val="20"/>
+        </w:rPr>
+        <w:t xml:space="preserve">             </w:t>
+      </w:r>
+      <w:r>
+        <w:rPr>
+          <w:rFonts w:ascii="Calibri" w:hAnsi="Calibri" w:cs="Calibri"/>
+          <w:bCs/>
+          <w:color w:val="404040" w:themeColor="text1" w:themeTint="BF"/>
+          <w:sz w:val="20"/>
+          <w:szCs w:val="20"/>
+        </w:rPr>
+        <w:t xml:space="preserve">   </w:t>
+      </w:r>
+      <w:r>
+        <w:rPr>
+          <w:rFonts w:ascii="Calibri" w:hAnsi="Calibri" w:cs="Calibri"/>
+          <w:bCs/>
+          <w:color w:val="404040" w:themeColor="text1" w:themeTint="BF"/>
+          <w:sz w:val="20"/>
+          <w:szCs w:val="20"/>
+        </w:rPr>
+        <w:t xml:space="preserve">             </w:t>
+      </w:r>
+      <w:r>
+        <w:rPr>
+          <w:rFonts w:ascii="Calibri" w:hAnsi="Calibri" w:cs="Calibri"/>
+          <w:bCs/>
+          <w:color w:val="404040" w:themeColor="text1" w:themeTint="BF"/>
+          <w:sz w:val="20"/>
+          <w:szCs w:val="20"/>
+        </w:rPr>
+        <w:t xml:space="preserve"> </w:t>
+      </w:r>
+      <w:r>
+        <w:rPr>
+          <w:rFonts w:ascii="Calibri" w:hAnsi="Calibri" w:cs="Calibri"/>
+          <w:bCs/>
+          <w:color w:val="404040" w:themeColor="text1" w:themeTint="BF"/>
+          <w:sz w:val="20"/>
+          <w:szCs w:val="20"/>
+        </w:rPr>
+        <w:t xml:space="preserve">        </w:t>
       </w:r>
       <w:r>
         <w:rPr>
@@ -746,45 +1394,27 @@
           <w:sz w:val="20"/>
           <w:szCs w:val="20"/>
         </w:rPr>
-        <w:t>Jul 2024 – Dec 2025 | Remote</w:t>
-      </w:r>
-    </w:p>
-    <w:p>
-      <w:pPr>
-        <w:pStyle w:val="ListParagraph"/>
-        <w:numPr>
-          <w:ilvl w:val="0"/>
-          <w:numId w:val="1"/>
-        </w:numPr>
-        <w:spacing w:after="0" w:line="276" w:lineRule="auto"/>
-        <w:ind w:left="547"/>
-        <w:rPr>
-          <w:rFonts w:ascii="Calibri" w:hAnsi="Calibri" w:cs="Calibri"/>
-          <w:color w:val="262626" w:themeColor="text1" w:themeTint="D9"/>
-        </w:rPr>
-      </w:pPr>
-      <w:r>
-        <w:rPr>
-          <w:rFonts w:ascii="Calibri" w:hAnsi="Calibri" w:cs="Calibri"/>
-          <w:color w:val="262626" w:themeColor="text1" w:themeTint="D9"/>
-        </w:rPr>
-        <w:t>Migrated backend</w:t>
-      </w:r>
-      <w:r>
-        <w:rPr>
-          <w:rFonts w:ascii="Calibri" w:hAnsi="Calibri" w:cs="Calibri"/>
-          <w:b/>
-          <w:bCs/>
-          <w:color w:val="262626" w:themeColor="text1" w:themeTint="D9"/>
-        </w:rPr>
-        <w:t xml:space="preserve"> from Express.js to NestJS</w:t>
-      </w:r>
-      <w:r>
-        <w:rPr>
-          <w:rFonts w:ascii="Calibri" w:hAnsi="Calibri" w:cs="Calibri"/>
-          <w:color w:val="262626" w:themeColor="text1" w:themeTint="D9"/>
-        </w:rPr>
-        <w:t>, refactoring architecture into a modular, scalable structure</w:t>
+        <w:t xml:space="preserve">Jul 2024 </w:t>
+      </w:r>
+      <w:r>
+        <w:rPr>
+          <w:rFonts w:ascii="Calibri" w:hAnsi="Calibri" w:cs="Calibri"/>
+          <w:b/>
+          <w:color w:val="0D0D0D" w:themeColor="text1" w:themeTint="F2"/>
+          <w:sz w:val="20"/>
+          <w:szCs w:val="20"/>
+        </w:rPr>
+        <w:t>-</w:t>
+      </w:r>
+      <w:r>
+        <w:rPr>
+          <w:rFonts w:ascii="Calibri" w:hAnsi="Calibri" w:cs="Calibri"/>
+          <w:b/>
+          <w:color w:val="0D0D0D" w:themeColor="text1" w:themeTint="F2"/>
+          <w:sz w:val="20"/>
+          <w:szCs w:val="20"/>
+        </w:rPr>
+        <w:t xml:space="preserve"> Dec 2025 | Remote</w:t>
       </w:r>
     </w:p>
     <w:p>
@@ -806,39 +1436,85 @@
           <w:rFonts w:ascii="Calibri" w:hAnsi="Calibri" w:cs="Calibri"/>
           <w:color w:val="262626" w:themeColor="text1" w:themeTint="D9"/>
         </w:rPr>
-        <w:t xml:space="preserve">Migrated a disorganized legacy dataset </w:t>
-      </w:r>
-      <w:r>
-        <w:rPr>
-          <w:rFonts w:ascii="Calibri" w:hAnsi="Calibri" w:cs="Calibri"/>
-          <w:b/>
-          <w:bCs/>
-          <w:color w:val="262626" w:themeColor="text1" w:themeTint="D9"/>
-        </w:rPr>
-        <w:t>from MongoDB to PostgreSQL</w:t>
-      </w:r>
-      <w:r>
-        <w:rPr>
-          <w:rFonts w:ascii="Calibri" w:hAnsi="Calibri" w:cs="Calibri"/>
-          <w:color w:val="262626" w:themeColor="text1" w:themeTint="D9"/>
-        </w:rPr>
-        <w:t xml:space="preserve">, redesigning schema, optimizing queries and indexing strategy, </w:t>
-      </w:r>
-      <w:r>
-        <w:rPr>
-          <w:rFonts w:ascii="Calibri" w:hAnsi="Calibri" w:cs="Calibri"/>
-          <w:b/>
-          <w:bCs/>
-          <w:color w:val="262626" w:themeColor="text1" w:themeTint="D9"/>
-        </w:rPr>
-        <w:t>improving overall system performance by ~35% and reporting speed by ~50%</w:t>
-      </w:r>
-      <w:r>
-        <w:rPr>
-          <w:rFonts w:ascii="Calibri" w:hAnsi="Calibri" w:cs="Calibri"/>
-          <w:color w:val="262626" w:themeColor="text1" w:themeTint="D9"/>
-        </w:rPr>
-        <w:t>, while ensuring data integrity and consistency during migration.</w:t>
+        <w:t>Built core</w:t>
+      </w:r>
+      <w:r>
+        <w:rPr>
+          <w:rFonts w:ascii="Calibri" w:hAnsi="Calibri" w:cs="Calibri"/>
+          <w:color w:val="262626" w:themeColor="text1" w:themeTint="D9"/>
+        </w:rPr>
+        <w:t xml:space="preserve"> the</w:t>
+      </w:r>
+      <w:r>
+        <w:rPr>
+          <w:rFonts w:ascii="Calibri" w:hAnsi="Calibri" w:cs="Calibri"/>
+          <w:color w:val="262626" w:themeColor="text1" w:themeTint="D9"/>
+        </w:rPr>
+        <w:t xml:space="preserve"> modules of </w:t>
+      </w:r>
+      <w:r>
+        <w:rPr>
+          <w:rFonts w:ascii="Calibri" w:hAnsi="Calibri" w:cs="Calibri"/>
+          <w:b/>
+          <w:bCs/>
+          <w:color w:val="262626" w:themeColor="text1" w:themeTint="D9"/>
+        </w:rPr>
+        <w:t>the e-commerce platform</w:t>
+      </w:r>
+      <w:r>
+        <w:rPr>
+          <w:rFonts w:ascii="Calibri" w:hAnsi="Calibri" w:cs="Calibri"/>
+          <w:color w:val="262626" w:themeColor="text1" w:themeTint="D9"/>
+        </w:rPr>
+        <w:t>, covering the product catalog</w:t>
+      </w:r>
+      <w:r>
+        <w:rPr>
+          <w:rFonts w:ascii="Calibri" w:hAnsi="Calibri" w:cs="Calibri"/>
+          <w:color w:val="262626" w:themeColor="text1" w:themeTint="D9"/>
+        </w:rPr>
+        <w:t>s</w:t>
+      </w:r>
+      <w:r>
+        <w:rPr>
+          <w:rFonts w:ascii="Calibri" w:hAnsi="Calibri" w:cs="Calibri"/>
+          <w:color w:val="262626" w:themeColor="text1" w:themeTint="D9"/>
+        </w:rPr>
+        <w:t xml:space="preserve">, cart, checkout, and order management for </w:t>
+      </w:r>
+      <w:r>
+        <w:rPr>
+          <w:rFonts w:ascii="Calibri" w:hAnsi="Calibri" w:cs="Calibri"/>
+          <w:b/>
+          <w:bCs/>
+          <w:color w:val="262626" w:themeColor="text1" w:themeTint="D9"/>
+        </w:rPr>
+        <w:t>5,000+ product</w:t>
+      </w:r>
+      <w:r>
+        <w:rPr>
+          <w:rFonts w:ascii="Calibri" w:hAnsi="Calibri" w:cs="Calibri"/>
+          <w:b/>
+          <w:bCs/>
+          <w:color w:val="262626" w:themeColor="text1" w:themeTint="D9"/>
+        </w:rPr>
+        <w:t xml:space="preserve">s and variants </w:t>
+      </w:r>
+      <w:r>
+        <w:rPr>
+          <w:rFonts w:ascii="Calibri" w:hAnsi="Calibri" w:cs="Calibri"/>
+          <w:b/>
+          <w:bCs/>
+          <w:color w:val="262626" w:themeColor="text1" w:themeTint="D9"/>
+        </w:rPr>
+        <w:t>across multiple warehouses</w:t>
+      </w:r>
+      <w:r>
+        <w:rPr>
+          <w:rFonts w:ascii="Calibri" w:hAnsi="Calibri" w:cs="Calibri"/>
+          <w:color w:val="262626" w:themeColor="text1" w:themeTint="D9"/>
+        </w:rPr>
+        <w:t>.</w:t>
       </w:r>
     </w:p>
     <w:p>
@@ -858,34 +1534,116 @@
       <w:r>
         <w:rPr>
           <w:rFonts w:ascii="Calibri" w:hAnsi="Calibri" w:cs="Calibri"/>
-          <w:b/>
-          <w:bCs/>
-          <w:color w:val="262626" w:themeColor="text1" w:themeTint="D9"/>
-        </w:rPr>
-        <w:t>Improved page load performance by ~45%</w:t>
-      </w:r>
-      <w:r>
-        <w:rPr>
-          <w:rFonts w:ascii="Calibri" w:hAnsi="Calibri" w:cs="Calibri"/>
-          <w:color w:val="262626" w:themeColor="text1" w:themeTint="D9"/>
-        </w:rPr>
-        <w:t xml:space="preserve"> using Incremental Static Regeneration (</w:t>
-      </w:r>
-      <w:r>
-        <w:rPr>
-          <w:rFonts w:ascii="Calibri" w:hAnsi="Calibri" w:cs="Calibri"/>
-          <w:b/>
-          <w:bCs/>
-          <w:color w:val="262626" w:themeColor="text1" w:themeTint="D9"/>
-        </w:rPr>
-        <w:t>ISR</w:t>
-      </w:r>
-      <w:r>
-        <w:rPr>
-          <w:rFonts w:ascii="Calibri" w:hAnsi="Calibri" w:cs="Calibri"/>
-          <w:color w:val="262626" w:themeColor="text1" w:themeTint="D9"/>
-        </w:rPr>
-        <w:t>) and image optimization</w:t>
+          <w:color w:val="262626" w:themeColor="text1" w:themeTint="D9"/>
+        </w:rPr>
+        <w:t xml:space="preserve">Integrated </w:t>
+      </w:r>
+      <w:r>
+        <w:rPr>
+          <w:rFonts w:ascii="Calibri" w:hAnsi="Calibri" w:cs="Calibri"/>
+          <w:b/>
+          <w:bCs/>
+          <w:color w:val="262626" w:themeColor="text1" w:themeTint="D9"/>
+        </w:rPr>
+        <w:t>Paymob payment gateway</w:t>
+      </w:r>
+      <w:r>
+        <w:rPr>
+          <w:rFonts w:ascii="Calibri" w:hAnsi="Calibri" w:cs="Calibri"/>
+          <w:color w:val="262626" w:themeColor="text1" w:themeTint="D9"/>
+        </w:rPr>
+        <w:t xml:space="preserve"> for secure online transactions</w:t>
+      </w:r>
+      <w:r>
+        <w:rPr>
+          <w:rFonts w:ascii="Calibri" w:hAnsi="Calibri" w:cs="Calibri"/>
+          <w:color w:val="262626" w:themeColor="text1" w:themeTint="D9"/>
+        </w:rPr>
+        <w:t>.</w:t>
+      </w:r>
+    </w:p>
+    <w:p>
+      <w:pPr>
+        <w:pStyle w:val="ListParagraph"/>
+        <w:numPr>
+          <w:ilvl w:val="0"/>
+          <w:numId w:val="1"/>
+        </w:numPr>
+        <w:spacing w:after="0" w:line="276" w:lineRule="auto"/>
+        <w:rPr>
+          <w:rFonts w:ascii="Calibri" w:hAnsi="Calibri" w:cs="Calibri"/>
+          <w:color w:val="262626" w:themeColor="text1" w:themeTint="D9"/>
+        </w:rPr>
+      </w:pPr>
+      <w:r>
+        <w:rPr>
+          <w:rFonts w:ascii="Calibri" w:hAnsi="Calibri" w:cs="Calibri"/>
+          <w:color w:val="262626" w:themeColor="text1" w:themeTint="D9"/>
+        </w:rPr>
+        <w:t xml:space="preserve">Developed key features of the </w:t>
+      </w:r>
+      <w:r>
+        <w:rPr>
+          <w:rFonts w:ascii="Calibri" w:hAnsi="Calibri" w:cs="Calibri"/>
+          <w:b/>
+          <w:bCs/>
+          <w:color w:val="262626" w:themeColor="text1" w:themeTint="D9"/>
+        </w:rPr>
+        <w:t>integrated</w:t>
+      </w:r>
+      <w:r>
+        <w:rPr>
+          <w:rFonts w:ascii="Calibri" w:hAnsi="Calibri" w:cs="Calibri" w:hint="cs"/>
+          <w:b/>
+          <w:bCs/>
+          <w:color w:val="262626" w:themeColor="text1" w:themeTint="D9"/>
+          <w:rtl/>
+        </w:rPr>
+        <w:t xml:space="preserve"> </w:t>
+      </w:r>
+      <w:r>
+        <w:rPr>
+          <w:rFonts w:ascii="Calibri" w:hAnsi="Calibri" w:cs="Calibri"/>
+          <w:b/>
+          <w:bCs/>
+          <w:color w:val="262626" w:themeColor="text1" w:themeTint="D9"/>
+        </w:rPr>
+        <w:t>accounting system</w:t>
+      </w:r>
+      <w:r>
+        <w:rPr>
+          <w:rFonts w:ascii="Calibri" w:hAnsi="Calibri" w:cs="Calibri"/>
+          <w:color w:val="262626" w:themeColor="text1" w:themeTint="D9"/>
+        </w:rPr>
+        <w:t xml:space="preserve"> and reporting modules for inventory</w:t>
+      </w:r>
+      <w:r>
+        <w:rPr>
+          <w:rFonts w:ascii="Calibri" w:hAnsi="Calibri" w:cs="Calibri"/>
+          <w:color w:val="262626" w:themeColor="text1" w:themeTint="D9"/>
+        </w:rPr>
+        <w:t xml:space="preserve"> and</w:t>
+      </w:r>
+      <w:r>
+        <w:rPr>
+          <w:rFonts w:ascii="Calibri" w:hAnsi="Calibri" w:cs="Calibri"/>
+          <w:color w:val="262626" w:themeColor="text1" w:themeTint="D9"/>
+        </w:rPr>
+        <w:t xml:space="preserve"> sale</w:t>
+      </w:r>
+      <w:r>
+        <w:rPr>
+          <w:rFonts w:ascii="Calibri" w:hAnsi="Calibri" w:cs="Calibri"/>
+          <w:color w:val="262626" w:themeColor="text1" w:themeTint="D9"/>
+        </w:rPr>
+        <w:t>s</w:t>
+      </w:r>
+      <w:r>
+        <w:rPr>
+          <w:rFonts w:ascii="Calibri" w:hAnsi="Calibri" w:cs="Calibri"/>
+          <w:color w:val="262626" w:themeColor="text1" w:themeTint="D9"/>
+        </w:rPr>
+        <w:t>.</w:t>
       </w:r>
     </w:p>
     <w:p>
@@ -907,13 +1665,19 @@
           <w:rFonts w:ascii="Calibri" w:hAnsi="Calibri" w:cs="Calibri"/>
           <w:color w:val="262626" w:themeColor="text1" w:themeTint="D9"/>
         </w:rPr>
-        <w:t>Implemented secure authentication</w:t>
-      </w:r>
-      <w:r>
-        <w:rPr>
-          <w:rFonts w:ascii="Calibri" w:hAnsi="Calibri" w:cs="Calibri"/>
-          <w:color w:val="262626" w:themeColor="text1" w:themeTint="D9"/>
-          <w:rtl/>
+        <w:t xml:space="preserve">Developed </w:t>
+      </w:r>
+      <w:r>
+        <w:rPr>
+          <w:rFonts w:ascii="Calibri" w:hAnsi="Calibri" w:cs="Calibri"/>
+          <w:color w:val="262626" w:themeColor="text1" w:themeTint="D9"/>
+        </w:rPr>
+        <w:t>an internal staff permission system</w:t>
+      </w:r>
+      <w:r>
+        <w:rPr>
+          <w:rFonts w:ascii="Calibri" w:hAnsi="Calibri" w:cs="Calibri"/>
+          <w:color w:val="262626" w:themeColor="text1" w:themeTint="D9"/>
         </w:rPr>
         <w:t xml:space="preserve"> </w:t>
       </w:r>
@@ -922,22 +1686,30 @@
           <w:rFonts w:ascii="Calibri" w:hAnsi="Calibri" w:cs="Calibri"/>
           <w:color w:val="262626" w:themeColor="text1" w:themeTint="D9"/>
         </w:rPr>
-        <w:t>using short-lived access token and refresh token rotation</w:t>
-      </w:r>
-      <w:r>
-        <w:rPr>
-          <w:rFonts w:ascii="Calibri" w:hAnsi="Calibri" w:cs="Calibri"/>
-          <w:color w:val="262626" w:themeColor="text1" w:themeTint="D9"/>
-          <w:rtl/>
-        </w:rPr>
-        <w:t xml:space="preserve"> </w:t>
-      </w:r>
-      <w:r>
-        <w:rPr>
-          <w:rFonts w:ascii="Calibri" w:hAnsi="Calibri" w:cs="Calibri"/>
-          <w:color w:val="262626" w:themeColor="text1" w:themeTint="D9"/>
-        </w:rPr>
-        <w:t>and Google OAuth</w:t>
+        <w:t xml:space="preserve">with </w:t>
+      </w:r>
+      <w:r>
+        <w:rPr>
+          <w:rFonts w:ascii="Calibri" w:hAnsi="Calibri" w:cs="Calibri"/>
+          <w:b/>
+          <w:bCs/>
+          <w:color w:val="262626" w:themeColor="text1" w:themeTint="D9"/>
+        </w:rPr>
+        <w:t>customizable permission system</w:t>
+      </w:r>
+      <w:r>
+        <w:rPr>
+          <w:rFonts w:ascii="Calibri" w:hAnsi="Calibri" w:cs="Calibri"/>
+          <w:color w:val="262626" w:themeColor="text1" w:themeTint="D9"/>
+        </w:rPr>
+        <w:t xml:space="preserve"> (beyond standard RBAC)</w:t>
+      </w:r>
+      <w:r>
+        <w:rPr>
+          <w:rFonts w:ascii="Calibri" w:hAnsi="Calibri" w:cs="Calibri"/>
+          <w:color w:val="262626" w:themeColor="text1" w:themeTint="D9"/>
+        </w:rPr>
+        <w:t>.</w:t>
       </w:r>
     </w:p>
     <w:p>
@@ -959,217 +1731,30 @@
           <w:rFonts w:ascii="Calibri" w:hAnsi="Calibri" w:cs="Calibri"/>
           <w:color w:val="262626" w:themeColor="text1" w:themeTint="D9"/>
         </w:rPr>
-        <w:t xml:space="preserve">Designed internal staff with </w:t>
-      </w:r>
-      <w:r>
-        <w:rPr>
-          <w:rFonts w:ascii="Calibri" w:hAnsi="Calibri" w:cs="Calibri"/>
-          <w:b/>
-          <w:bCs/>
-          <w:color w:val="262626" w:themeColor="text1" w:themeTint="D9"/>
-        </w:rPr>
-        <w:t>customizable permission system</w:t>
-      </w:r>
-      <w:r>
-        <w:rPr>
-          <w:rFonts w:ascii="Calibri" w:hAnsi="Calibri" w:cs="Calibri"/>
-          <w:color w:val="262626" w:themeColor="text1" w:themeTint="D9"/>
-        </w:rPr>
-        <w:t xml:space="preserve"> (beyond standard RBAC)</w:t>
-      </w:r>
-    </w:p>
-    <w:p>
-      <w:pPr>
-        <w:pStyle w:val="Style1"/>
-        <w:numPr>
-          <w:ilvl w:val="0"/>
-          <w:numId w:val="1"/>
-        </w:numPr>
-        <w:spacing w:line="276" w:lineRule="auto"/>
-        <w:ind w:left="547"/>
-        <w:jc w:val="left"/>
-        <w:rPr>
-          <w:rFonts w:ascii="Calibri" w:hAnsi="Calibri" w:cs="Calibri"/>
-          <w:color w:val="262626" w:themeColor="text1" w:themeTint="D9"/>
-        </w:rPr>
-      </w:pPr>
-      <w:r>
-        <w:rPr>
-          <w:rFonts w:ascii="Calibri" w:hAnsi="Calibri" w:cs="Calibri"/>
-          <w:color w:val="262626" w:themeColor="text1" w:themeTint="D9"/>
-        </w:rPr>
-        <w:t xml:space="preserve">Designed full </w:t>
-      </w:r>
-      <w:r>
-        <w:rPr>
-          <w:rFonts w:ascii="Calibri" w:hAnsi="Calibri" w:cs="Calibri"/>
-          <w:b/>
-          <w:bCs/>
-          <w:color w:val="262626" w:themeColor="text1" w:themeTint="D9"/>
-        </w:rPr>
-        <w:t>i18n support with Arabic and English</w:t>
-      </w:r>
-      <w:r>
-        <w:rPr>
-          <w:rFonts w:ascii="Calibri" w:hAnsi="Calibri" w:cs="Calibri"/>
-          <w:color w:val="262626" w:themeColor="text1" w:themeTint="D9"/>
-        </w:rPr>
-        <w:t xml:space="preserve"> multilingual experience</w:t>
-      </w:r>
-    </w:p>
-    <w:p>
-      <w:pPr>
-        <w:pStyle w:val="Style1"/>
-        <w:numPr>
-          <w:ilvl w:val="0"/>
-          <w:numId w:val="1"/>
-        </w:numPr>
-        <w:spacing w:line="276" w:lineRule="auto"/>
-        <w:ind w:left="547"/>
-        <w:rPr>
-          <w:rFonts w:ascii="Calibri" w:hAnsi="Calibri" w:cs="Calibri"/>
-          <w:color w:val="262626" w:themeColor="text1" w:themeTint="D9"/>
-        </w:rPr>
-      </w:pPr>
-      <w:r>
-        <w:rPr>
-          <w:rFonts w:ascii="Calibri" w:hAnsi="Calibri" w:cs="Calibri"/>
-          <w:color w:val="262626" w:themeColor="text1" w:themeTint="D9"/>
-        </w:rPr>
-        <w:t xml:space="preserve">Integrated </w:t>
-      </w:r>
-      <w:r>
-        <w:rPr>
-          <w:rFonts w:ascii="Calibri" w:hAnsi="Calibri" w:cs="Calibri"/>
-          <w:b/>
-          <w:bCs/>
-          <w:color w:val="262626" w:themeColor="text1" w:themeTint="D9"/>
-        </w:rPr>
-        <w:t>Paymob payment gateway</w:t>
-      </w:r>
-      <w:r>
-        <w:rPr>
-          <w:rFonts w:ascii="Calibri" w:hAnsi="Calibri" w:cs="Calibri"/>
-          <w:color w:val="262626" w:themeColor="text1" w:themeTint="D9"/>
-        </w:rPr>
-        <w:t xml:space="preserve"> for secure online transactions</w:t>
-      </w:r>
-    </w:p>
-    <w:p>
-      <w:pPr>
-        <w:pStyle w:val="Style1"/>
-        <w:numPr>
-          <w:ilvl w:val="0"/>
-          <w:numId w:val="1"/>
-        </w:numPr>
-        <w:spacing w:line="276" w:lineRule="auto"/>
-        <w:ind w:left="547"/>
-        <w:jc w:val="left"/>
-        <w:rPr>
-          <w:rFonts w:ascii="Calibri" w:hAnsi="Calibri" w:cs="Calibri"/>
-          <w:color w:val="262626" w:themeColor="text1" w:themeTint="D9"/>
-        </w:rPr>
-      </w:pPr>
-      <w:r>
-        <w:rPr>
-          <w:rFonts w:ascii="Calibri" w:hAnsi="Calibri" w:cs="Calibri"/>
-          <w:color w:val="262626" w:themeColor="text1" w:themeTint="D9"/>
-        </w:rPr>
-        <w:t xml:space="preserve">Implemented new </w:t>
-      </w:r>
-      <w:r>
-        <w:rPr>
-          <w:rFonts w:ascii="Calibri" w:hAnsi="Calibri" w:cs="Calibri"/>
-          <w:b/>
-          <w:bCs/>
-          <w:color w:val="262626" w:themeColor="text1" w:themeTint="D9"/>
-        </w:rPr>
-        <w:t>reporting and analytics modules</w:t>
-      </w:r>
-      <w:r>
-        <w:rPr>
-          <w:rFonts w:ascii="Calibri" w:hAnsi="Calibri" w:cs="Calibri"/>
-          <w:color w:val="262626" w:themeColor="text1" w:themeTint="D9"/>
-        </w:rPr>
-        <w:t xml:space="preserve"> for inventory, sales, and order tracking</w:t>
-      </w:r>
-    </w:p>
-    <w:p>
-      <w:pPr>
-        <w:pStyle w:val="Style1"/>
-        <w:numPr>
-          <w:ilvl w:val="0"/>
-          <w:numId w:val="1"/>
-        </w:numPr>
-        <w:spacing w:line="276" w:lineRule="auto"/>
-        <w:ind w:left="547"/>
-        <w:jc w:val="left"/>
-        <w:rPr>
-          <w:rFonts w:ascii="Calibri" w:hAnsi="Calibri" w:cs="Calibri"/>
-          <w:color w:val="262626" w:themeColor="text1" w:themeTint="D9"/>
-        </w:rPr>
-      </w:pPr>
-      <w:r>
-        <w:rPr>
-          <w:rFonts w:ascii="Calibri" w:hAnsi="Calibri" w:cs="Calibri"/>
-          <w:color w:val="262626" w:themeColor="text1" w:themeTint="D9"/>
-        </w:rPr>
-        <w:t xml:space="preserve">Managed the full </w:t>
-      </w:r>
-      <w:r>
-        <w:rPr>
-          <w:rFonts w:ascii="Calibri" w:hAnsi="Calibri" w:cs="Calibri"/>
-          <w:b/>
-          <w:bCs/>
-          <w:color w:val="262626" w:themeColor="text1" w:themeTint="D9"/>
-        </w:rPr>
-        <w:t>order lifecycle</w:t>
-      </w:r>
-      <w:r>
-        <w:rPr>
-          <w:rFonts w:ascii="Calibri" w:hAnsi="Calibri" w:cs="Calibri"/>
-          <w:color w:val="262626" w:themeColor="text1" w:themeTint="D9"/>
-        </w:rPr>
-        <w:t>: product catalog, cart, checkout, and order management</w:t>
-      </w:r>
-    </w:p>
-    <w:p>
-      <w:pPr>
-        <w:pStyle w:val="Style1"/>
-        <w:numPr>
-          <w:ilvl w:val="0"/>
-          <w:numId w:val="1"/>
-        </w:numPr>
-        <w:spacing w:line="276" w:lineRule="auto"/>
-        <w:ind w:left="547"/>
-        <w:jc w:val="left"/>
-        <w:rPr>
-          <w:rFonts w:ascii="Calibri" w:hAnsi="Calibri" w:cs="Calibri"/>
-          <w:color w:val="262626" w:themeColor="text1" w:themeTint="D9"/>
-        </w:rPr>
-      </w:pPr>
-      <w:r>
-        <w:rPr>
-          <w:rFonts w:ascii="Calibri" w:hAnsi="Calibri" w:cs="Calibri"/>
-          <w:color w:val="262626" w:themeColor="text1" w:themeTint="D9"/>
-        </w:rPr>
-        <w:t xml:space="preserve">Built and maintained </w:t>
-      </w:r>
-      <w:r>
-        <w:rPr>
-          <w:rFonts w:ascii="Calibri" w:hAnsi="Calibri" w:cs="Calibri"/>
-          <w:b/>
-          <w:bCs/>
-          <w:color w:val="262626" w:themeColor="text1" w:themeTint="D9"/>
-        </w:rPr>
-        <w:t>CI/CD pipelines using GitHub Actions for automated builds</w:t>
-      </w:r>
-      <w:r>
-        <w:rPr>
-          <w:rFonts w:ascii="Calibri" w:hAnsi="Calibri" w:cs="Calibri"/>
-          <w:color w:val="262626" w:themeColor="text1" w:themeTint="D9"/>
-        </w:rPr>
-        <w:t xml:space="preserve"> and production releases</w:t>
+        <w:t xml:space="preserve">Designed a modular </w:t>
+      </w:r>
+      <w:r>
+        <w:rPr>
+          <w:rFonts w:ascii="Calibri" w:hAnsi="Calibri" w:cs="Calibri"/>
+          <w:b/>
+          <w:bCs/>
+          <w:color w:val="262626" w:themeColor="text1" w:themeTint="D9"/>
+        </w:rPr>
+        <w:t>internationalized architecture (i18n)</w:t>
+      </w:r>
+      <w:r>
+        <w:rPr>
+          <w:rFonts w:ascii="Calibri" w:hAnsi="Calibri" w:cs="Calibri"/>
+          <w:color w:val="262626" w:themeColor="text1" w:themeTint="D9"/>
+        </w:rPr>
+        <w:t xml:space="preserve"> supporting Arabic and English</w:t>
+      </w:r>
+      <w:r>
+        <w:rPr>
+          <w:rFonts w:ascii="Calibri" w:hAnsi="Calibri" w:cs="Calibri"/>
+          <w:color w:val="262626" w:themeColor="text1" w:themeTint="D9"/>
+        </w:rPr>
+        <w:t>.</w:t>
       </w:r>
     </w:p>
     <w:p>
@@ -1328,8 +1913,9 @@
         <w:sectPr>
           <w:type w:val="continuous"/>
           <w:pgSz w:w="11906" w:h="16838"/>
-          <w:pgMar w:top="720" w:right="720" w:bottom="720" w:left="720" w:header="720" w:footer="720" w:gutter="0"/>
+          <w:pgMar w:top="936" w:right="720" w:bottom="936" w:left="720" w:header="720" w:footer="720" w:gutter="0"/>
           <w:cols w:space="720"/>
+          <w:docGrid w:linePitch="299"/>
         </w:sectPr>
       </w:pPr>
     </w:p>
@@ -1345,13 +1931,17 @@
           <w:rFonts w:ascii="Calibri" w:hAnsi="Calibri" w:cs="Calibri"/>
           <w:bCs/>
           <w:color w:val="262626" w:themeColor="text1" w:themeTint="D9"/>
-        </w:rPr>
-      </w:pPr>
-      <w:r>
-        <w:rPr>
-          <w:rFonts w:ascii="Calibri" w:hAnsi="Calibri" w:cs="Calibri"/>
-          <w:b/>
-          <w:color w:val="262626" w:themeColor="text1" w:themeTint="D9"/>
+          <w:sz w:val="20"/>
+          <w:szCs w:val="20"/>
+        </w:rPr>
+      </w:pPr>
+      <w:r>
+        <w:rPr>
+          <w:rFonts w:ascii="Calibri" w:hAnsi="Calibri" w:cs="Calibri"/>
+          <w:b/>
+          <w:color w:val="262626" w:themeColor="text1" w:themeTint="D9"/>
+          <w:sz w:val="20"/>
+          <w:szCs w:val="20"/>
         </w:rPr>
         <w:t>Languages:</w:t>
       </w:r>
@@ -1360,6 +1950,8 @@
           <w:rFonts w:ascii="Calibri" w:hAnsi="Calibri" w:cs="Calibri"/>
           <w:bCs/>
           <w:color w:val="262626" w:themeColor="text1" w:themeTint="D9"/>
+          <w:sz w:val="20"/>
+          <w:szCs w:val="20"/>
         </w:rPr>
         <w:t xml:space="preserve"> TypeScript, JavaScript</w:t>
       </w:r>
@@ -1376,47 +1968,29 @@
           <w:rFonts w:ascii="Calibri" w:hAnsi="Calibri" w:cs="Calibri"/>
           <w:bCs/>
           <w:color w:val="262626" w:themeColor="text1" w:themeTint="D9"/>
-        </w:rPr>
-      </w:pPr>
-      <w:r>
-        <w:rPr>
-          <w:rFonts w:ascii="Calibri" w:hAnsi="Calibri" w:cs="Calibri"/>
-          <w:b/>
-          <w:color w:val="262626" w:themeColor="text1" w:themeTint="D9"/>
-        </w:rPr>
-        <w:t>Frontend Development</w:t>
-      </w:r>
-      <w:r>
-        <w:rPr>
-          <w:rFonts w:ascii="Calibri" w:hAnsi="Calibri" w:cs="Calibri"/>
-          <w:b/>
-          <w:color w:val="262626" w:themeColor="text1" w:themeTint="D9"/>
-        </w:rPr>
-        <w:t>:</w:t>
-      </w:r>
-      <w:r>
-        <w:rPr>
-          <w:rFonts w:ascii="Calibri" w:hAnsi="Calibri" w:cs="Calibri"/>
-          <w:bCs/>
-          <w:color w:val="262626" w:themeColor="text1" w:themeTint="D9"/>
-        </w:rPr>
-        <w:t xml:space="preserve"> React, Next.js, Tailwind</w:t>
-      </w:r>
-      <w:r>
-        <w:rPr>
-          <w:rFonts w:ascii="Calibri" w:hAnsi="Calibri" w:cs="Calibri"/>
-          <w:bCs/>
-          <w:color w:val="262626" w:themeColor="text1" w:themeTint="D9"/>
-        </w:rPr>
-        <w:t xml:space="preserve">, </w:t>
-      </w:r>
-      <w:r>
-        <w:rPr>
-          <w:rFonts w:ascii="Calibri" w:hAnsi="Calibri" w:cs="Calibri"/>
-          <w:bCs/>
-          <w:color w:val="262626" w:themeColor="text1" w:themeTint="D9"/>
-        </w:rPr>
-        <w:t>Shadcn</w:t>
+          <w:sz w:val="20"/>
+          <w:szCs w:val="20"/>
+        </w:rPr>
+      </w:pPr>
+      <w:r>
+        <w:rPr>
+          <w:rFonts w:ascii="Calibri" w:hAnsi="Calibri" w:cs="Calibri"/>
+          <w:b/>
+          <w:color w:val="262626" w:themeColor="text1" w:themeTint="D9"/>
+          <w:sz w:val="20"/>
+          <w:szCs w:val="20"/>
+        </w:rPr>
+        <w:t>Frontend:</w:t>
+      </w:r>
+      <w:r>
+        <w:rPr>
+          <w:rFonts w:ascii="Calibri" w:hAnsi="Calibri" w:cs="Calibri"/>
+          <w:bCs/>
+          <w:color w:val="262626" w:themeColor="text1" w:themeTint="D9"/>
+          <w:sz w:val="20"/>
+          <w:szCs w:val="20"/>
+        </w:rPr>
+        <w:t xml:space="preserve"> React, Next.js, Tailwind, Shadcn</w:t>
       </w:r>
     </w:p>
     <w:p>
@@ -1431,53 +2005,27 @@
           <w:rFonts w:ascii="Calibri" w:hAnsi="Calibri" w:cs="Calibri"/>
           <w:bCs/>
           <w:color w:val="262626" w:themeColor="text1" w:themeTint="D9"/>
-        </w:rPr>
-      </w:pPr>
-      <w:r>
-        <w:rPr>
-          <w:rFonts w:ascii="Calibri" w:hAnsi="Calibri" w:cs="Calibri"/>
-          <w:b/>
-          <w:color w:val="262626" w:themeColor="text1" w:themeTint="D9"/>
-        </w:rPr>
-        <w:t>Backend</w:t>
-      </w:r>
-      <w:r>
-        <w:rPr>
-          <w:rFonts w:ascii="Calibri" w:hAnsi="Calibri" w:cs="Calibri"/>
-          <w:b/>
-          <w:color w:val="262626" w:themeColor="text1" w:themeTint="D9"/>
-        </w:rPr>
-        <w:t xml:space="preserve"> Devel</w:t>
-      </w:r>
-      <w:r>
-        <w:rPr>
-          <w:rFonts w:ascii="Calibri" w:hAnsi="Calibri" w:cs="Calibri"/>
-          <w:b/>
-          <w:color w:val="262626" w:themeColor="text1" w:themeTint="D9"/>
-        </w:rPr>
-        <w:t>o</w:t>
-      </w:r>
-      <w:r>
-        <w:rPr>
-          <w:rFonts w:ascii="Calibri" w:hAnsi="Calibri" w:cs="Calibri"/>
-          <w:b/>
-          <w:color w:val="262626" w:themeColor="text1" w:themeTint="D9"/>
-        </w:rPr>
-        <w:t>pment</w:t>
-      </w:r>
-      <w:r>
-        <w:rPr>
-          <w:rFonts w:ascii="Calibri" w:hAnsi="Calibri" w:cs="Calibri"/>
-          <w:b/>
-          <w:color w:val="262626" w:themeColor="text1" w:themeTint="D9"/>
-        </w:rPr>
-        <w:t>:</w:t>
-      </w:r>
-      <w:r>
-        <w:rPr>
-          <w:rFonts w:ascii="Calibri" w:hAnsi="Calibri" w:cs="Calibri"/>
-          <w:bCs/>
-          <w:color w:val="262626" w:themeColor="text1" w:themeTint="D9"/>
+          <w:sz w:val="20"/>
+          <w:szCs w:val="20"/>
+        </w:rPr>
+      </w:pPr>
+      <w:r>
+        <w:rPr>
+          <w:rFonts w:ascii="Calibri" w:hAnsi="Calibri" w:cs="Calibri"/>
+          <w:b/>
+          <w:color w:val="262626" w:themeColor="text1" w:themeTint="D9"/>
+          <w:sz w:val="20"/>
+          <w:szCs w:val="20"/>
+        </w:rPr>
+        <w:t>Backend:</w:t>
+      </w:r>
+      <w:r>
+        <w:rPr>
+          <w:rFonts w:ascii="Calibri" w:hAnsi="Calibri" w:cs="Calibri"/>
+          <w:bCs/>
+          <w:color w:val="262626" w:themeColor="text1" w:themeTint="D9"/>
+          <w:sz w:val="20"/>
+          <w:szCs w:val="20"/>
         </w:rPr>
         <w:t xml:space="preserve"> Node.js, Express.js, NestJS</w:t>
       </w:r>
@@ -1494,23 +2042,49 @@
           <w:rFonts w:ascii="Calibri" w:hAnsi="Calibri" w:cs="Calibri"/>
           <w:b/>
           <w:color w:val="262626" w:themeColor="text1" w:themeTint="D9"/>
-        </w:rPr>
-      </w:pPr>
-      <w:r>
-        <w:rPr>
-          <w:rFonts w:ascii="Calibri" w:hAnsi="Calibri" w:cs="Calibri"/>
-          <w:b/>
-          <w:color w:val="262626" w:themeColor="text1" w:themeTint="D9"/>
-        </w:rPr>
-        <w:t xml:space="preserve">Databases &amp; ORMs: </w:t>
-      </w:r>
-      <w:r>
-        <w:rPr>
-          <w:rFonts w:ascii="Calibri" w:hAnsi="Calibri" w:cs="Calibri"/>
-          <w:bCs/>
-          <w:color w:val="262626" w:themeColor="text1" w:themeTint="D9"/>
-        </w:rPr>
-        <w:t>PostgreSQL, MongoDB, Drizzle ORM, Mongoose</w:t>
+          <w:sz w:val="20"/>
+          <w:szCs w:val="20"/>
+        </w:rPr>
+      </w:pPr>
+      <w:r>
+        <w:rPr>
+          <w:rFonts w:ascii="Calibri" w:hAnsi="Calibri" w:cs="Calibri"/>
+          <w:b/>
+          <w:color w:val="262626" w:themeColor="text1" w:themeTint="D9"/>
+          <w:sz w:val="20"/>
+          <w:szCs w:val="20"/>
+        </w:rPr>
+        <w:t>Data</w:t>
+      </w:r>
+      <w:r>
+        <w:rPr>
+          <w:rFonts w:ascii="Calibri" w:hAnsi="Calibri" w:cs="Calibri"/>
+          <w:b/>
+          <w:color w:val="262626" w:themeColor="text1" w:themeTint="D9"/>
+          <w:sz w:val="20"/>
+          <w:szCs w:val="20"/>
+        </w:rPr>
+        <w:t>bases</w:t>
+      </w:r>
+      <w:r>
+        <w:rPr>
+          <w:rFonts w:ascii="Calibri" w:hAnsi="Calibri" w:cs="Calibri"/>
+          <w:b/>
+          <w:color w:val="262626" w:themeColor="text1" w:themeTint="D9"/>
+          <w:sz w:val="20"/>
+          <w:szCs w:val="20"/>
+        </w:rPr>
+        <w:t xml:space="preserve">: </w:t>
+      </w:r>
+      <w:r>
+        <w:rPr>
+          <w:rFonts w:ascii="Calibri" w:hAnsi="Calibri" w:cs="Calibri"/>
+          <w:bCs/>
+          <w:color w:val="262626" w:themeColor="text1" w:themeTint="D9"/>
+          <w:sz w:val="20"/>
+          <w:szCs w:val="20"/>
+        </w:rPr>
+        <w:t>PostgreSQL, MongoDB, Drizzle, Mongoose</w:t>
       </w:r>
     </w:p>
     <w:p>
@@ -1525,13 +2099,17 @@
           <w:rFonts w:ascii="Calibri" w:hAnsi="Calibri" w:cs="Calibri"/>
           <w:b/>
           <w:color w:val="262626" w:themeColor="text1" w:themeTint="D9"/>
-        </w:rPr>
-      </w:pPr>
-      <w:r>
-        <w:rPr>
-          <w:rFonts w:ascii="Calibri" w:hAnsi="Calibri" w:cs="Calibri"/>
-          <w:b/>
-          <w:color w:val="262626" w:themeColor="text1" w:themeTint="D9"/>
+          <w:sz w:val="20"/>
+          <w:szCs w:val="20"/>
+        </w:rPr>
+      </w:pPr>
+      <w:r>
+        <w:rPr>
+          <w:rFonts w:ascii="Calibri" w:hAnsi="Calibri" w:cs="Calibri"/>
+          <w:b/>
+          <w:color w:val="262626" w:themeColor="text1" w:themeTint="D9"/>
+          <w:sz w:val="20"/>
+          <w:szCs w:val="20"/>
         </w:rPr>
         <w:t>DevOps &amp; Cloud:</w:t>
       </w:r>
@@ -1540,110 +2118,30 @@
           <w:rFonts w:ascii="Calibri" w:hAnsi="Calibri" w:cs="Calibri"/>
           <w:bCs/>
           <w:color w:val="262626" w:themeColor="text1" w:themeTint="D9"/>
-        </w:rPr>
-        <w:t xml:space="preserve"> Linux, Nginx,</w:t>
-      </w:r>
-      <w:r>
-        <w:rPr>
-          <w:rFonts w:ascii="Calibri" w:hAnsi="Calibri" w:cs="Calibri"/>
-          <w:bCs/>
-          <w:color w:val="262626" w:themeColor="text1" w:themeTint="D9"/>
-        </w:rPr>
-        <w:t xml:space="preserve"> </w:t>
-      </w:r>
-      <w:r>
-        <w:rPr>
-          <w:rFonts w:ascii="Calibri" w:hAnsi="Calibri" w:cs="Calibri"/>
-          <w:bCs/>
-          <w:color w:val="262626" w:themeColor="text1" w:themeTint="D9"/>
-        </w:rPr>
-        <w:t>Docker</w:t>
-      </w:r>
-      <w:r>
-        <w:rPr>
-          <w:rFonts w:ascii="Calibri" w:hAnsi="Calibri" w:cs="Calibri"/>
-          <w:bCs/>
-          <w:color w:val="262626" w:themeColor="text1" w:themeTint="D9"/>
-        </w:rPr>
-        <w:t>,</w:t>
-      </w:r>
-      <w:r>
-        <w:rPr>
-          <w:rFonts w:ascii="Calibri" w:hAnsi="Calibri" w:cs="Calibri"/>
-          <w:bCs/>
-          <w:color w:val="262626" w:themeColor="text1" w:themeTint="D9"/>
-        </w:rPr>
-        <w:t xml:space="preserve"> GitHub Actions (CI/CD), Vercel</w:t>
-      </w:r>
-    </w:p>
-    <w:p>
-      <w:pPr>
-        <w:pStyle w:val="Style1"/>
-        <w:numPr>
-          <w:ilvl w:val="0"/>
-          <w:numId w:val="2"/>
-        </w:numPr>
-        <w:spacing w:line="276" w:lineRule="auto"/>
-        <w:rPr>
-          <w:rFonts w:ascii="Calibri" w:hAnsi="Calibri" w:cs="Calibri"/>
-          <w:bCs/>
-          <w:color w:val="262626" w:themeColor="text1" w:themeTint="D9"/>
-        </w:rPr>
-      </w:pPr>
-      <w:r>
-        <w:rPr>
-          <w:rFonts w:ascii="Calibri" w:hAnsi="Calibri" w:cs="Calibri"/>
-          <w:b/>
-          <w:color w:val="262626" w:themeColor="text1" w:themeTint="D9"/>
-        </w:rPr>
-        <w:t>Practices</w:t>
-      </w:r>
-      <w:r>
-        <w:rPr>
-          <w:rFonts w:ascii="Calibri" w:hAnsi="Calibri" w:cs="Calibri"/>
-          <w:bCs/>
-          <w:color w:val="262626" w:themeColor="text1" w:themeTint="D9"/>
-        </w:rPr>
-        <w:t>: Agile/Scrum, System Design, Data Modeling, Modular Architecture</w:t>
-      </w:r>
-      <w:r>
-        <w:rPr>
-          <w:rFonts w:ascii="Calibri" w:hAnsi="Calibri" w:cs="Calibri"/>
-          <w:bCs/>
-          <w:color w:val="262626" w:themeColor="text1" w:themeTint="D9"/>
-        </w:rPr>
-        <w:t>, Unit Testing (Jest)</w:t>
-      </w:r>
-    </w:p>
-    <w:p>
-      <w:pPr>
-        <w:pStyle w:val="Style1"/>
-        <w:numPr>
-          <w:ilvl w:val="0"/>
-          <w:numId w:val="2"/>
-        </w:numPr>
-        <w:spacing w:line="276" w:lineRule="auto"/>
-        <w:rPr>
-          <w:rFonts w:ascii="Calibri" w:hAnsi="Calibri" w:cs="Calibri"/>
-          <w:bCs/>
-          <w:color w:val="262626" w:themeColor="text1" w:themeTint="D9"/>
-        </w:rPr>
-      </w:pPr>
-      <w:r>
-        <w:rPr>
-          <w:rFonts w:ascii="Calibri" w:hAnsi="Calibri" w:cs="Calibri"/>
-          <w:b/>
-          <w:color w:val="262626" w:themeColor="text1" w:themeTint="D9"/>
-        </w:rPr>
-        <w:t>API &amp; Integrations</w:t>
-      </w:r>
-      <w:r>
-        <w:rPr>
-          <w:rFonts w:ascii="Calibri" w:hAnsi="Calibri" w:cs="Calibri"/>
-          <w:bCs/>
-          <w:color w:val="262626" w:themeColor="text1" w:themeTint="D9"/>
-        </w:rPr>
-        <w:t>: RESTful APIs, WebSocket, GraphQL</w:t>
+          <w:sz w:val="20"/>
+          <w:szCs w:val="20"/>
+        </w:rPr>
+        <w:t xml:space="preserve"> Linux, Nginx, Docker, GitHub Actions</w:t>
+      </w:r>
+      <w:r>
+        <w:rPr>
+          <w:rFonts w:ascii="Calibri" w:hAnsi="Calibri" w:cs="Calibri"/>
+          <w:bCs/>
+          <w:color w:val="262626" w:themeColor="text1" w:themeTint="D9"/>
+          <w:sz w:val="20"/>
+          <w:szCs w:val="20"/>
+        </w:rPr>
+        <w:t xml:space="preserve">, </w:t>
+      </w:r>
+      <w:r>
+        <w:rPr>
+          <w:rFonts w:ascii="Calibri" w:hAnsi="Calibri" w:cs="Calibri"/>
+          <w:bCs/>
+          <w:color w:val="262626" w:themeColor="text1" w:themeTint="D9"/>
+          <w:sz w:val="20"/>
+          <w:szCs w:val="20"/>
+        </w:rPr>
+        <w:t>CI/CD, Vercel</w:t>
       </w:r>
     </w:p>
     <w:p>
@@ -1658,6 +2156,8 @@
         <w:rPr>
           <w:rFonts w:ascii="Calibri" w:hAnsi="Calibri" w:cs="Calibri"/>
           <w:color w:val="262626" w:themeColor="text1" w:themeTint="D9"/>
+          <w:sz w:val="20"/>
+          <w:szCs w:val="20"/>
         </w:rPr>
       </w:pPr>
       <w:bookmarkStart w:id="0" w:name="_Hlk229047665"/>
@@ -1666,6 +2166,8 @@
           <w:rFonts w:ascii="Calibri" w:hAnsi="Calibri" w:cs="Calibri"/>
           <w:b/>
           <w:color w:val="262626" w:themeColor="text1" w:themeTint="D9"/>
+          <w:sz w:val="20"/>
+          <w:szCs w:val="20"/>
         </w:rPr>
         <w:t>Payment Integrations:</w:t>
       </w:r>
@@ -1674,11 +2176,124 @@
           <w:rFonts w:ascii="Calibri" w:hAnsi="Calibri" w:cs="Calibri"/>
           <w:bCs/>
           <w:color w:val="262626" w:themeColor="text1" w:themeTint="D9"/>
+          <w:sz w:val="20"/>
+          <w:szCs w:val="20"/>
         </w:rPr>
         <w:t xml:space="preserve"> Stripe, Paymob</w:t>
       </w:r>
+      <w:bookmarkEnd w:id="0"/>
     </w:p>
-    <w:bookmarkEnd w:id="0"/>
+    <w:p>
+      <w:pPr>
+        <w:pStyle w:val="Style1"/>
+        <w:numPr>
+          <w:ilvl w:val="0"/>
+          <w:numId w:val="2"/>
+        </w:numPr>
+        <w:spacing w:line="276" w:lineRule="auto"/>
+        <w:rPr>
+          <w:rFonts w:ascii="Calibri" w:hAnsi="Calibri" w:cs="Calibri"/>
+          <w:bCs/>
+          <w:color w:val="262626" w:themeColor="text1" w:themeTint="D9"/>
+          <w:sz w:val="20"/>
+          <w:szCs w:val="20"/>
+        </w:rPr>
+      </w:pPr>
+      <w:r>
+        <w:rPr>
+          <w:rFonts w:ascii="Calibri" w:hAnsi="Calibri" w:cs="Calibri"/>
+          <w:b/>
+          <w:color w:val="262626" w:themeColor="text1" w:themeTint="D9"/>
+          <w:sz w:val="20"/>
+          <w:szCs w:val="20"/>
+        </w:rPr>
+        <w:t>API &amp;</w:t>
+      </w:r>
+      <w:r>
+        <w:rPr>
+          <w:rFonts w:ascii="Calibri" w:hAnsi="Calibri" w:cs="Calibri"/>
+          <w:b/>
+          <w:color w:val="262626" w:themeColor="text1" w:themeTint="D9"/>
+          <w:sz w:val="20"/>
+          <w:szCs w:val="20"/>
+        </w:rPr>
+        <w:t xml:space="preserve"> Protocols</w:t>
+      </w:r>
+      <w:r>
+        <w:rPr>
+          <w:rFonts w:ascii="Calibri" w:hAnsi="Calibri" w:cs="Calibri"/>
+          <w:bCs/>
+          <w:color w:val="262626" w:themeColor="text1" w:themeTint="D9"/>
+          <w:sz w:val="20"/>
+          <w:szCs w:val="20"/>
+        </w:rPr>
+        <w:t>: RESTful APIs, WebSocket, GraphQL</w:t>
+      </w:r>
+    </w:p>
+    <w:p>
+      <w:pPr>
+        <w:pStyle w:val="Style1"/>
+        <w:numPr>
+          <w:ilvl w:val="0"/>
+          <w:numId w:val="2"/>
+        </w:numPr>
+        <w:spacing w:line="276" w:lineRule="auto"/>
+        <w:rPr>
+          <w:rFonts w:ascii="Calibri" w:hAnsi="Calibri" w:cs="Calibri"/>
+          <w:bCs/>
+          <w:color w:val="262626" w:themeColor="text1" w:themeTint="D9"/>
+          <w:sz w:val="20"/>
+          <w:szCs w:val="20"/>
+        </w:rPr>
+        <w:sectPr>
+          <w:type w:val="continuous"/>
+          <w:pgSz w:w="11906" w:h="16838" w:code="9"/>
+          <w:pgMar w:top="720" w:right="720" w:bottom="720" w:left="720" w:header="720" w:footer="720" w:gutter="0"/>
+          <w:cols w:num="2" w:space="720"/>
+          <w:docGrid w:linePitch="360"/>
+        </w:sectPr>
+      </w:pPr>
+      <w:r>
+        <w:rPr>
+          <w:rFonts w:ascii="Calibri" w:hAnsi="Calibri" w:cs="Calibri"/>
+          <w:b/>
+          <w:color w:val="262626" w:themeColor="text1" w:themeTint="D9"/>
+          <w:sz w:val="20"/>
+          <w:szCs w:val="20"/>
+        </w:rPr>
+        <w:t>Practices</w:t>
+      </w:r>
+      <w:r>
+        <w:rPr>
+          <w:rFonts w:ascii="Calibri" w:hAnsi="Calibri" w:cs="Calibri"/>
+          <w:bCs/>
+          <w:color w:val="262626" w:themeColor="text1" w:themeTint="D9"/>
+          <w:sz w:val="20"/>
+          <w:szCs w:val="20"/>
+        </w:rPr>
+        <w:t xml:space="preserve">: Agile/Scrum, System Design, Data Modeling, Modular Architecture, Unit Testing </w:t>
+      </w:r>
+      <w:r>
+        <w:rPr>
+          <w:rFonts w:ascii="Calibri" w:hAnsi="Calibri" w:cs="Calibri"/>
+          <w:bCs/>
+          <w:color w:val="262626" w:themeColor="text1" w:themeTint="D9"/>
+          <w:sz w:val="20"/>
+          <w:szCs w:val="20"/>
+        </w:rPr>
+        <w:t xml:space="preserve">with </w:t>
+      </w:r>
+      <w:r>
+        <w:rPr>
+          <w:rFonts w:ascii="Calibri" w:hAnsi="Calibri" w:cs="Calibri"/>
+          <w:bCs/>
+          <w:color w:val="262626" w:themeColor="text1" w:themeTint="D9"/>
+          <w:sz w:val="20"/>
+          <w:szCs w:val="20"/>
+        </w:rPr>
+        <w:t>Jest</w:t>
+      </w:r>
+    </w:p>
     <w:p>
       <w:pPr>
         <w:pStyle w:val="Style1"/>
@@ -1883,6 +2498,35 @@
         </w:rPr>
         <w:t>(GPA: 3.2 / 4.0)</w:t>
       </w:r>
+      <w:r>
+        <w:rPr>
+          <w:rFonts w:ascii="Calibri" w:hAnsi="Calibri" w:cs="Calibri"/>
+          <w:color w:val="262626" w:themeColor="text1" w:themeTint="D9"/>
+        </w:rPr>
+        <w:t xml:space="preserve">                             </w:t>
+      </w:r>
+      <w:r>
+        <w:rPr>
+          <w:rFonts w:ascii="Calibri" w:hAnsi="Calibri" w:cs="Calibri"/>
+          <w:b/>
+          <w:bCs/>
+          <w:color w:val="262626" w:themeColor="text1" w:themeTint="D9"/>
+          <w:sz w:val="20"/>
+          <w:szCs w:val="20"/>
+        </w:rPr>
+        <w:t>Oct 2020 - Jun</w:t>
+      </w:r>
+      <w:r>
+        <w:rPr>
+          <w:rFonts w:ascii="Calibri" w:hAnsi="Calibri" w:cs="Calibri"/>
+          <w:b/>
+          <w:bCs/>
+          <w:color w:val="262626" w:themeColor="text1" w:themeTint="D9"/>
+          <w:sz w:val="20"/>
+          <w:szCs w:val="20"/>
+        </w:rPr>
+        <w:t xml:space="preserve"> 2024</w:t>
+      </w:r>
     </w:p>
     <w:p>
       <w:pPr>
@@ -1904,28 +2548,28 @@
         </w:rPr>
         <w:t xml:space="preserve">Graduation Project: </w:t>
       </w:r>
-      <w:r>
-        <w:rPr>
-          <w:rFonts w:ascii="Calibri" w:hAnsi="Calibri" w:cs="Calibri"/>
-          <w:b/>
-          <w:bCs/>
-          <w:color w:val="262626" w:themeColor="text1" w:themeTint="D9"/>
-        </w:rPr>
-        <w:t xml:space="preserve">Pro Sales CRM • A+ </w:t>
-      </w:r>
       <w:hyperlink r:id="rId11" w:history="1">
         <w:r>
           <w:rPr>
             <w:rStyle w:val="Hyperlink"/>
-            <w:rFonts w:ascii="Segoe UI Emoji" w:hAnsi="Segoe UI Emoji" w:cs="Segoe UI Emoji"/>
+            <w:rFonts w:ascii="Calibri" w:hAnsi="Calibri" w:cs="Calibri"/>
             <w:b/>
-            <w:sz w:val="16"/>
-            <w:szCs w:val="16"/>
+            <w:bCs/>
+            <w:color w:val="262626" w:themeColor="text1" w:themeTint="D9"/>
             <w:u w:val="none"/>
           </w:rPr>
-          <w:t>🔗</w:t>
+          <w:t>Pro Sales CRM</w:t>
         </w:r>
       </w:hyperlink>
+      <w:r>
+        <w:rPr>
+          <w:rFonts w:ascii="Calibri" w:hAnsi="Calibri" w:cs="Calibri"/>
+          <w:b/>
+          <w:bCs/>
+          <w:color w:val="262626" w:themeColor="text1" w:themeTint="D9"/>
+        </w:rPr>
+        <w:t xml:space="preserve"> • A+</w:t>
+      </w:r>
     </w:p>
     <w:sectPr>
       <w:type w:val="continuous"/>
@@ -3264,6 +3908,18 @@
       <w:szCs w:val="22"/>
     </w:rPr>
   </w:style>
+  <w:style w:type="character" w:styleId="UnresolvedMention">
+    <w:name w:val="Unresolved Mention"/>
+    <w:basedOn w:val="DefaultParagraphFont"/>
+    <w:uiPriority w:val="99"/>
+    <w:semiHidden/>
+    <w:unhideWhenUsed/>
+    <w:rsid w:val="00AE222E"/>
+    <w:rPr>
+      <w:color w:val="605E5C"/>
+      <w:shd w:val="clear" w:color="auto" w:fill="E1DFDD"/>
+    </w:rPr>
+  </w:style>
 </w:styles>
 </file>
 

</xml_diff>

<commit_message>
Refactor layout of WorkSection component to improve responsiveness and visual hierarchy. Update project details and enhance SVG icons for better representation of technologies used.
</commit_message>
<xml_diff>
--- a/public/Ahmed_Magdy_CV.docx
+++ b/public/Ahmed_Magdy_CV.docx
@@ -422,6 +422,7 @@
           <w:color w:val="0D0D0D" w:themeColor="text1" w:themeTint="F2"/>
           <w:sz w:val="24"/>
           <w:szCs w:val="24"/>
+          <w:u w:val="single"/>
         </w:rPr>
         <w:t>MOG Group</w:t>
       </w:r>
@@ -465,6 +466,7 @@
         </w:rPr>
         <w:t>Full-</w:t>
       </w:r>
+      <w:proofErr w:type="gramStart"/>
       <w:r>
         <w:rPr>
           <w:rFonts w:ascii="Calibri" w:hAnsi="Calibri" w:cs="Calibri"/>
@@ -493,7 +495,18 @@
           <w:sz w:val="20"/>
           <w:szCs w:val="20"/>
         </w:rPr>
-        <w:t xml:space="preserve">      </w:t>
+        <w:t xml:space="preserve"> </w:t>
+      </w:r>
+      <w:proofErr w:type="gramEnd"/>
+      <w:r>
+        <w:rPr>
+          <w:rFonts w:ascii="Calibri" w:hAnsi="Calibri" w:cs="Calibri"/>
+          <w:bCs/>
+          <w:color w:val="404040" w:themeColor="text1" w:themeTint="BF"/>
+          <w:sz w:val="20"/>
+          <w:szCs w:val="20"/>
+        </w:rPr>
+        <w:t xml:space="preserve">     </w:t>
       </w:r>
       <w:r>
         <w:rPr>
@@ -788,7 +801,6 @@
             <w:color w:val="0D0D0D" w:themeColor="text1" w:themeTint="F2"/>
             <w:sz w:val="24"/>
             <w:szCs w:val="24"/>
-            <w:u w:val="none"/>
           </w:rPr>
           <w:t>Gen Z Wellness App</w:t>
         </w:r>
@@ -821,7 +833,29 @@
           <w:sz w:val="20"/>
           <w:szCs w:val="20"/>
         </w:rPr>
-        <w:t xml:space="preserve">Full Stack Engineer (Contract)                                                                </w:t>
+        <w:t>Full Stack Engineer (</w:t>
+      </w:r>
+      <w:proofErr w:type="gramStart"/>
+      <w:r>
+        <w:rPr>
+          <w:rFonts w:ascii="Calibri" w:hAnsi="Calibri" w:cs="Calibri"/>
+          <w:bCs/>
+          <w:color w:val="404040" w:themeColor="text1" w:themeTint="BF"/>
+          <w:sz w:val="20"/>
+          <w:szCs w:val="20"/>
+        </w:rPr>
+        <w:t xml:space="preserve">Contract)   </w:t>
+      </w:r>
+      <w:proofErr w:type="gramEnd"/>
+      <w:r>
+        <w:rPr>
+          <w:rFonts w:ascii="Calibri" w:hAnsi="Calibri" w:cs="Calibri"/>
+          <w:bCs/>
+          <w:color w:val="404040" w:themeColor="text1" w:themeTint="BF"/>
+          <w:sz w:val="20"/>
+          <w:szCs w:val="20"/>
+        </w:rPr>
+        <w:t xml:space="preserve">                                                             </w:t>
       </w:r>
       <w:r>
         <w:rPr>
@@ -1076,16 +1110,7 @@
           <w:bCs/>
           <w:color w:val="262626" w:themeColor="text1" w:themeTint="D9"/>
         </w:rPr>
-        <w:t>session</w:t>
-      </w:r>
-      <w:r>
-        <w:rPr>
-          <w:rFonts w:ascii="Calibri" w:hAnsi="Calibri" w:cs="Calibri"/>
-          <w:b/>
-          <w:bCs/>
-          <w:color w:val="262626" w:themeColor="text1" w:themeTint="D9"/>
-        </w:rPr>
-        <w:t xml:space="preserve"> booking system</w:t>
+        <w:t>session booking system</w:t>
       </w:r>
       <w:r>
         <w:rPr>
@@ -1289,7 +1314,6 @@
             <w:color w:val="0D0D0D" w:themeColor="text1" w:themeTint="F2"/>
             <w:sz w:val="24"/>
             <w:szCs w:val="24"/>
-            <w:u w:val="none"/>
           </w:rPr>
           <w:t>Leopard Store</w:t>
         </w:r>
@@ -1301,7 +1325,6 @@
             <w:color w:val="0D0D0D" w:themeColor="text1" w:themeTint="F2"/>
             <w:sz w:val="24"/>
             <w:szCs w:val="24"/>
-            <w:u w:val="none"/>
           </w:rPr>
           <w:t>s</w:t>
         </w:r>
@@ -1324,7 +1347,29 @@
           <w:sz w:val="20"/>
           <w:szCs w:val="20"/>
         </w:rPr>
-        <w:t xml:space="preserve">Full Stack Engineer (Contract)                     </w:t>
+        <w:t>Full Stack Engineer (</w:t>
+      </w:r>
+      <w:proofErr w:type="gramStart"/>
+      <w:r>
+        <w:rPr>
+          <w:rFonts w:ascii="Calibri" w:hAnsi="Calibri" w:cs="Calibri"/>
+          <w:bCs/>
+          <w:color w:val="404040" w:themeColor="text1" w:themeTint="BF"/>
+          <w:sz w:val="20"/>
+          <w:szCs w:val="20"/>
+        </w:rPr>
+        <w:t xml:space="preserve">Contract)   </w:t>
+      </w:r>
+      <w:proofErr w:type="gramEnd"/>
+      <w:r>
+        <w:rPr>
+          <w:rFonts w:ascii="Calibri" w:hAnsi="Calibri" w:cs="Calibri"/>
+          <w:bCs/>
+          <w:color w:val="404040" w:themeColor="text1" w:themeTint="BF"/>
+          <w:sz w:val="20"/>
+          <w:szCs w:val="20"/>
+        </w:rPr>
+        <w:t xml:space="preserve">                  </w:t>
       </w:r>
       <w:r>
         <w:rPr>
@@ -1489,25 +1534,7 @@
           <w:bCs/>
           <w:color w:val="262626" w:themeColor="text1" w:themeTint="D9"/>
         </w:rPr>
-        <w:t>5,000+ product</w:t>
-      </w:r>
-      <w:r>
-        <w:rPr>
-          <w:rFonts w:ascii="Calibri" w:hAnsi="Calibri" w:cs="Calibri"/>
-          <w:b/>
-          <w:bCs/>
-          <w:color w:val="262626" w:themeColor="text1" w:themeTint="D9"/>
-        </w:rPr>
-        <w:t xml:space="preserve">s and variants </w:t>
-      </w:r>
-      <w:r>
-        <w:rPr>
-          <w:rFonts w:ascii="Calibri" w:hAnsi="Calibri" w:cs="Calibri"/>
-          <w:b/>
-          <w:bCs/>
-          <w:color w:val="262626" w:themeColor="text1" w:themeTint="D9"/>
-        </w:rPr>
-        <w:t>across multiple warehouses</w:t>
+        <w:t>5,000+ products and variants across multiple warehouses</w:t>
       </w:r>
       <w:r>
         <w:rPr>
@@ -1672,14 +1699,7 @@
           <w:rFonts w:ascii="Calibri" w:hAnsi="Calibri" w:cs="Calibri"/>
           <w:color w:val="262626" w:themeColor="text1" w:themeTint="D9"/>
         </w:rPr>
-        <w:t>an internal staff permission system</w:t>
-      </w:r>
-      <w:r>
-        <w:rPr>
-          <w:rFonts w:ascii="Calibri" w:hAnsi="Calibri" w:cs="Calibri"/>
-          <w:color w:val="262626" w:themeColor="text1" w:themeTint="D9"/>
-        </w:rPr>
-        <w:t xml:space="preserve"> </w:t>
+        <w:t xml:space="preserve">an internal staff permission system </w:t>
       </w:r>
       <w:r>
         <w:rPr>
@@ -2556,7 +2576,6 @@
             <w:b/>
             <w:bCs/>
             <w:color w:val="262626" w:themeColor="text1" w:themeTint="D9"/>
-            <w:u w:val="none"/>
           </w:rPr>
           <w:t>Pro Sales CRM</w:t>
         </w:r>
@@ -3544,6 +3563,7 @@
   <w:style w:type="character" w:default="1" w:styleId="DefaultParagraphFont">
     <w:name w:val="Default Paragraph Font"/>
     <w:uiPriority w:val="1"/>
+    <w:semiHidden/>
     <w:unhideWhenUsed/>
   </w:style>
   <w:style w:type="table" w:default="1" w:styleId="TableNormal">

</xml_diff>